<commit_message>
Fix runtime binding hot reload
</commit_message>
<xml_diff>
--- a/docs/SFRD-TS-01-3.2_MSS Claw版本总体设计说明书（编写中）.docx
+++ b/docs/SFRD-TS-01-3.2_MSS Claw版本总体设计说明书（编写中）.docx
@@ -7383,333 +7383,83 @@
     <w:p>
       <w:pPr>
         <w:spacing w:line="360" w:lineRule="auto"/>
-        <w:rPr/>
-      </w:pPr>
+        <w:rPr>
+          <w:sz w:val="24"/>
+        </w:rPr>
+      </w:pPr>
+      <w:r>
+        <w:rPr>
+          <w:rFonts w:ascii="Arial" w:hAnsi="Arial" w:eastAsia="宋体" w:cs="Arial"/>
+          <w:sz w:val="24"/>
+          <w:szCs w:val="18"/>
+        </w:rPr>
+        <w:t/>
+      </w:r>
     </w:p>
-    <w:tbl>
-      <w:tblPr>
-        <w:tblStyle w:val="000012"/>
-        <w:tblW w:w="0" w:type="auto"/>
-        <w:tblInd w:w="0" w:type="dxa"/>
-        <w:tblBorders>
-          <w:top w:val="single" w:color="auto" w:sz="4" w:space="0"/>
-          <w:left w:val="single" w:color="auto" w:sz="4" w:space="0"/>
-          <w:bottom w:val="single" w:color="auto" w:sz="4" w:space="0"/>
-          <w:right w:val="single" w:color="auto" w:sz="4" w:space="0"/>
-          <w:insideH w:val="single" w:color="auto" w:sz="4" w:space="0"/>
-          <w:insideV w:val="single" w:color="auto" w:sz="4" w:space="0"/>
-        </w:tblBorders>
-        <w:tblLayout w:type="fixed"/>
-        <w:tblCellMar>
-          <w:top w:w="0" w:type="dxa"/>
-          <w:left w:w="108" w:type="dxa"/>
-          <w:bottom w:w="0" w:type="dxa"/>
-          <w:right w:w="108" w:type="dxa"/>
-        </w:tblCellMar>
-      </w:tblPr>
-      <w:tblGrid>
-        <w:gridCol w:w="3819"/>
-        <w:gridCol w:w="3819"/>
-        <w:gridCol w:w="3819"/>
-        <w:gridCol w:w="3819"/>
-      </w:tblGrid>
-      <w:tr>
-        <w:trPr>
-          <w:trHeight w:val="674" w:hRule="atLeast"/>
-        </w:trPr>
-        <w:tc>
-          <w:tcPr>
-            <w:tcW w:w="3819" w:type="dxa"/>
-            <w:shd w:val="clear" w:color="auto" w:fill="D9D9D9"/>
-            <w:vAlign w:val="center"/>
-          </w:tcPr>
-          <w:p>
-            <w:pPr>
-              <w:spacing w:line="276" w:lineRule="auto"/>
-              <w:rPr>
-                <w:sz w:val="24"/>
-              </w:rPr>
-            </w:pPr>
-            <w:r>
-              <w:rPr>
-                <w:rFonts w:ascii="Arial" w:hAnsi="Arial" w:eastAsia="宋体" w:cs="Arial"/>
-                <w:b/>
-                <w:bCs/>
-                <w:sz w:val="24"/>
-                <w:szCs w:val="18"/>
-              </w:rPr>
-              <w:t>方案</w:t>
-            </w:r>
-          </w:p>
-        </w:tc>
-        <w:tc>
-          <w:tcPr>
-            <w:tcW w:w="3819" w:type="dxa"/>
-            <w:shd w:val="clear" w:color="auto" w:fill="D9D9D9"/>
-            <w:vAlign w:val="center"/>
-          </w:tcPr>
-          <w:p>
-            <w:pPr>
-              <w:spacing w:line="276" w:lineRule="auto"/>
-              <w:rPr>
-                <w:sz w:val="24"/>
-              </w:rPr>
-            </w:pPr>
-            <w:r>
-              <w:rPr>
-                <w:rFonts w:ascii="Arial" w:hAnsi="Arial" w:eastAsia="宋体" w:cs="Arial"/>
-                <w:b/>
-                <w:bCs/>
-                <w:sz w:val="24"/>
-                <w:szCs w:val="18"/>
-              </w:rPr>
-              <w:t>优点</w:t>
-            </w:r>
-          </w:p>
-        </w:tc>
-        <w:tc>
-          <w:tcPr>
-            <w:tcW w:w="3819" w:type="dxa"/>
-            <w:shd w:val="clear" w:color="auto" w:fill="D9D9D9"/>
-            <w:vAlign w:val="center"/>
-          </w:tcPr>
-          <w:p>
-            <w:pPr>
-              <w:spacing w:line="276" w:lineRule="auto"/>
-              <w:rPr>
-                <w:sz w:val="24"/>
-              </w:rPr>
-            </w:pPr>
-            <w:r>
-              <w:rPr>
-                <w:rFonts w:ascii="Arial" w:hAnsi="Arial" w:eastAsia="宋体" w:cs="Arial"/>
-                <w:b/>
-                <w:bCs/>
-                <w:sz w:val="24"/>
-                <w:szCs w:val="18"/>
-              </w:rPr>
-              <w:t>风险</w:t>
-            </w:r>
-          </w:p>
-        </w:tc>
-        <w:tc>
-          <w:tcPr>
-            <w:tcW w:w="3819" w:type="dxa"/>
-            <w:shd w:val="clear" w:color="auto" w:fill="D9D9D9"/>
-            <w:vAlign w:val="center"/>
-          </w:tcPr>
-          <w:p>
-            <w:pPr>
-              <w:spacing w:line="276" w:lineRule="auto"/>
-              <w:rPr>
-                <w:sz w:val="24"/>
-              </w:rPr>
-            </w:pPr>
-            <w:r>
-              <w:rPr>
-                <w:rFonts w:ascii="Arial" w:hAnsi="Arial" w:eastAsia="宋体" w:cs="Arial"/>
-                <w:b/>
-                <w:bCs/>
-                <w:sz w:val="24"/>
-                <w:szCs w:val="18"/>
-              </w:rPr>
-              <w:t>选择</w:t>
-            </w:r>
-          </w:p>
-        </w:tc>
-      </w:tr>
-      <w:tr>
-        <w:trPr>
-          <w:trHeight w:val="674" w:hRule="atLeast"/>
-        </w:trPr>
-        <w:tc>
-          <w:tcPr>
-            <w:tcW w:w="3819" w:type="dxa"/>
-            <w:vAlign w:val="center"/>
-          </w:tcPr>
-          <w:p>
-            <w:pPr>
-              <w:spacing w:line="276" w:lineRule="auto"/>
-              <w:rPr>
-                <w:sz w:val="24"/>
-              </w:rPr>
-            </w:pPr>
-            <w:r>
-              <w:rPr>
-                <w:rFonts w:ascii="Arial" w:hAnsi="Arial" w:eastAsia="宋体" w:cs="Arial"/>
-                <w:sz w:val="24"/>
-                <w:szCs w:val="18"/>
-              </w:rPr>
-              <w:t>OpenClaw</w:t>
-            </w:r>
-          </w:p>
-        </w:tc>
-        <w:tc>
-          <w:tcPr>
-            <w:tcW w:w="3819" w:type="dxa"/>
-            <w:vAlign w:val="center"/>
-          </w:tcPr>
-          <w:p>
-            <w:pPr>
-              <w:spacing w:line="276" w:lineRule="auto"/>
-              <w:rPr>
-                <w:sz w:val="24"/>
-              </w:rPr>
-            </w:pPr>
-            <w:r>
-              <w:rPr>
-                <w:rFonts w:ascii="Arial" w:hAnsi="Arial" w:eastAsia="宋体" w:cs="Arial"/>
-                <w:sz w:val="24"/>
-                <w:szCs w:val="18"/>
-              </w:rPr>
-              <w:t>主入口匹配；Skill 分层与跨 IM 关联贴产品</w:t>
-            </w:r>
-          </w:p>
-        </w:tc>
-        <w:tc>
-          <w:tcPr>
-            <w:tcW w:w="3819" w:type="dxa"/>
-            <w:vAlign w:val="center"/>
-          </w:tcPr>
-          <w:p>
-            <w:pPr>
-              <w:spacing w:line="276" w:lineRule="auto"/>
-              <w:rPr>
-                <w:sz w:val="24"/>
-              </w:rPr>
-            </w:pPr>
-            <w:r>
-              <w:rPr>
-                <w:rFonts w:ascii="Arial" w:hAnsi="Arial" w:eastAsia="宋体" w:cs="Arial"/>
-                <w:sz w:val="24"/>
-                <w:szCs w:val="18"/>
-              </w:rPr>
-              <w:t>多用户底座自建</w:t>
-            </w:r>
-          </w:p>
-        </w:tc>
-        <w:tc>
-          <w:tcPr>
-            <w:tcW w:w="3819" w:type="dxa"/>
-            <w:vAlign w:val="center"/>
-          </w:tcPr>
-          <w:p>
-            <w:pPr>
-              <w:spacing w:line="276" w:lineRule="auto"/>
-              <w:rPr>
-                <w:sz w:val="24"/>
-              </w:rPr>
-            </w:pPr>
-            <w:r>
-              <w:rPr>
-                <w:rFonts w:ascii="Arial" w:hAnsi="Arial" w:eastAsia="宋体" w:cs="Arial"/>
-                <w:sz w:val="24"/>
-                <w:szCs w:val="18"/>
-              </w:rPr>
-              <w:t>是</w:t>
-            </w:r>
-          </w:p>
-        </w:tc>
-      </w:tr>
-      <w:tr>
-        <w:trPr>
-          <w:trHeight w:val="674" w:hRule="atLeast"/>
-        </w:trPr>
-        <w:tc>
-          <w:tcPr>
-            <w:tcW w:w="3819" w:type="dxa"/>
-            <w:vAlign w:val="center"/>
-          </w:tcPr>
-          <w:p>
-            <w:pPr>
-              <w:spacing w:line="276" w:lineRule="auto"/>
-              <w:rPr>
-                <w:sz w:val="24"/>
-              </w:rPr>
-            </w:pPr>
-            <w:r>
-              <w:rPr>
-                <w:rFonts w:ascii="Arial" w:hAnsi="Arial" w:eastAsia="宋体" w:cs="Arial"/>
-                <w:sz w:val="24"/>
-                <w:szCs w:val="18"/>
-              </w:rPr>
-              <w:t>Hermes</w:t>
-            </w:r>
-          </w:p>
-        </w:tc>
-        <w:tc>
-          <w:tcPr>
-            <w:tcW w:w="3819" w:type="dxa"/>
-            <w:vAlign w:val="center"/>
-          </w:tcPr>
-          <w:p>
-            <w:pPr>
-              <w:spacing w:line="276" w:lineRule="auto"/>
-              <w:rPr>
-                <w:sz w:val="24"/>
-              </w:rPr>
-            </w:pPr>
-            <w:r>
-              <w:rPr>
-                <w:rFonts w:ascii="Arial" w:hAnsi="Arial" w:eastAsia="宋体" w:cs="Arial"/>
-                <w:sz w:val="24"/>
-                <w:szCs w:val="18"/>
-              </w:rPr>
-              <w:t>会话/群聊强</w:t>
-            </w:r>
-          </w:p>
-        </w:tc>
-        <w:tc>
-          <w:tcPr>
-            <w:tcW w:w="3819" w:type="dxa"/>
-            <w:vAlign w:val="center"/>
-          </w:tcPr>
-          <w:p>
-            <w:pPr>
-              <w:spacing w:line="276" w:lineRule="auto"/>
-              <w:rPr>
-                <w:sz w:val="24"/>
-              </w:rPr>
-            </w:pPr>
-            <w:r>
-              <w:rPr>
-                <w:rFonts w:ascii="Arial" w:hAnsi="Arial" w:eastAsia="宋体" w:cs="Arial"/>
-                <w:sz w:val="24"/>
-                <w:szCs w:val="18"/>
-              </w:rPr>
-              <w:t>跨 IM 与 Skill 分层补齐成本高</w:t>
-            </w:r>
-          </w:p>
-        </w:tc>
-        <w:tc>
-          <w:tcPr>
-            <w:tcW w:w="3819" w:type="dxa"/>
-            <w:vAlign w:val="center"/>
-          </w:tcPr>
-          <w:p>
-            <w:pPr>
-              <w:spacing w:line="276" w:lineRule="auto"/>
-              <w:rPr>
-                <w:sz w:val="24"/>
-              </w:rPr>
-            </w:pPr>
-            <w:r>
-              <w:rPr>
-                <w:rFonts w:ascii="Arial" w:hAnsi="Arial" w:eastAsia="宋体" w:cs="Arial"/>
-                <w:sz w:val="24"/>
-                <w:szCs w:val="18"/>
-              </w:rPr>
-              <w:t>否（对照）</w:t>
-            </w:r>
-          </w:p>
-        </w:tc>
-      </w:tr>
-    </w:tbl>
     <w:p>
       <w:pPr>
+        <w:pStyle w:val="000031"/>
         <w:spacing w:line="360" w:lineRule="auto"/>
-        <w:rPr/>
-      </w:pPr>
+        <w:rPr>
+          <w:sz w:val="24"/>
+        </w:rPr>
+      </w:pPr>
+      <w:r>
+        <w:rPr>
+          <w:rFonts w:ascii="Arial" w:hAnsi="Arial" w:eastAsia="宋体" w:cs="Arial"/>
+          <w:sz w:val="24"/>
+          <w:szCs w:val="18"/>
+        </w:rPr>
+        <w:t>结论：</w:t>
+      </w:r>
+    </w:p>
+    <w:p>
+      <w:pPr>
+        <w:spacing w:line="360" w:lineRule="auto"/>
+        <w:rPr>
+          <w:sz w:val="24"/>
+        </w:rPr>
+      </w:pPr>
+      <w:r>
+        <w:rPr>
+          <w:rFonts w:ascii="Arial" w:hAnsi="Arial" w:eastAsia="宋体" w:cs="Arial"/>
+          <w:sz w:val="24"/>
+          <w:szCs w:val="18"/>
+        </w:rPr>
+        <w:t>采用 OpenClaw 作为 Agent 内核，主要原因是其 session/peer、workspace/extraDirs 及 agent-IM 绑定机制更贴合企微私聊交付、企业 Skill 分层和跨 IM 身份关联。</w:t>
+      </w:r>
+    </w:p>
+    <w:p>
+      <w:pPr>
+        <w:spacing w:line="360" w:lineRule="auto"/>
+        <w:rPr>
+          <w:sz w:val="24"/>
+        </w:rPr>
+      </w:pPr>
+      <w:r>
+        <w:rPr>
+          <w:rFonts w:ascii="Arial" w:hAnsi="Arial" w:eastAsia="宋体" w:cs="Arial"/>
+          <w:sz w:val="24"/>
+          <w:szCs w:val="18"/>
+        </w:rPr>
+        <w:t>Hermes 本期不作为主内核，仅作为后续会话/群聊能力演进参考；OpenClaw 的多用户底座由 Console、Runtime 配置、绑定路由和门禁能力补齐。</w:t>
+      </w:r>
+    </w:p>
+    <w:p>
+      <w:pPr>
+        <w:spacing w:line="360" w:lineRule="auto"/>
+        <w:rPr>
+          <w:sz w:val="24"/>
+        </w:rPr>
+      </w:pPr>
+      <w:r>
+        <w:rPr>
+          <w:rFonts w:ascii="Arial" w:hAnsi="Arial" w:eastAsia="宋体" w:cs="Arial"/>
+          <w:sz w:val="24"/>
+          <w:szCs w:val="18"/>
+        </w:rPr>
+        <w:t/>
+      </w:r>
     </w:p>
     <w:p>
       <w:pPr>
@@ -7923,15 +7673,33 @@
           <w:numId w:val="1"/>
         </w:numPr>
         <w:spacing w:line="360" w:lineRule="auto"/>
-        <w:rPr/>
+        <w:rPr>
+          <w:sz w:val="24"/>
+        </w:rPr>
       </w:pPr>
       <w:r>
         <w:rPr>
           <w:rFonts w:ascii="Arial" w:hAnsi="Arial" w:eastAsia="宋体" w:cs="Arial"/>
-          <w:b/>
-          <w:bCs/>
-        </w:rPr>
-        <w:t>决策点三：SOP 执行架构（双路径并存）</w:t>
+          <w:sz w:val="24"/>
+          <w:szCs w:val="18"/>
+        </w:rPr>
+        <w:t>决策点三：SOP 执行架构选型</w:t>
+      </w:r>
+    </w:p>
+    <w:p>
+      <w:pPr>
+        <w:spacing w:line="360" w:lineRule="auto"/>
+        <w:rPr>
+          <w:sz w:val="24"/>
+        </w:rPr>
+      </w:pPr>
+      <w:r>
+        <w:rPr>
+          <w:rFonts w:ascii="Arial" w:hAnsi="Arial" w:eastAsia="宋体" w:cs="Arial"/>
+          <w:sz w:val="24"/>
+          <w:szCs w:val="18"/>
+        </w:rPr>
+        <w:t>SOP 执行架构需同时覆盖两类诉求：新场景快速验证和稳定生产流程治理。前者强调接入速度，后者强调状态管理、失败恢复、审计和复用。</w:t>
       </w:r>
     </w:p>
     <w:tbl>
@@ -7956,1307 +7724,10 @@
         </w:tblCellMar>
       </w:tblPr>
       <w:tblGrid>
-        <w:gridCol w:w="2969"/>
-        <w:gridCol w:w="1344"/>
-        <w:gridCol w:w="1759"/>
-        <w:gridCol w:w="1564"/>
-        <w:gridCol w:w="1909"/>
-        <w:gridCol w:w="1909"/>
-        <w:gridCol w:w="1909"/>
-        <w:gridCol w:w="1909"/>
-      </w:tblGrid>
-      <w:tr>
-        <w:trPr>
-          <w:trHeight w:val="645" w:hRule="atLeast"/>
-        </w:trPr>
-        <w:tc>
-          <w:tcPr>
-            <w:tcW w:w="2969" w:type="dxa"/>
-            <w:shd w:val="clear" w:color="auto" w:fill="D9D9D9"/>
-            <w:vAlign w:val="center"/>
-          </w:tcPr>
-          <w:p>
-            <w:pPr>
-              <w:spacing w:line="276" w:lineRule="auto"/>
-              <w:rPr>
-                <w:sz w:val="24"/>
-              </w:rPr>
-            </w:pPr>
-            <w:r>
-              <w:rPr>
-                <w:rFonts w:ascii="Arial" w:hAnsi="Arial" w:eastAsia="宋体" w:cs="Arial"/>
-                <w:b/>
-                <w:bCs/>
-                <w:sz w:val="24"/>
-                <w:szCs w:val="18"/>
-              </w:rPr>
-              <w:t>评估准则</w:t>
-            </w:r>
-          </w:p>
-        </w:tc>
-        <w:tc>
-          <w:tcPr>
-            <w:tcW w:w="1344" w:type="dxa"/>
-            <w:shd w:val="clear" w:color="auto" w:fill="D9D9D9"/>
-            <w:vAlign w:val="center"/>
-          </w:tcPr>
-          <w:p>
-            <w:pPr>
-              <w:spacing w:line="276" w:lineRule="auto"/>
-              <w:rPr>
-                <w:sz w:val="24"/>
-              </w:rPr>
-            </w:pPr>
-            <w:r>
-              <w:rPr>
-                <w:rFonts w:ascii="Arial" w:hAnsi="Arial" w:eastAsia="宋体" w:cs="Arial"/>
-                <w:b/>
-                <w:bCs/>
-                <w:sz w:val="24"/>
-                <w:szCs w:val="18"/>
-              </w:rPr>
-              <w:t>权重</w:t>
-            </w:r>
-          </w:p>
-        </w:tc>
-        <w:tc>
-          <w:tcPr>
-            <w:tcW w:w="1759" w:type="dxa"/>
-            <w:shd w:val="clear" w:color="auto" w:fill="D9D9D9"/>
-            <w:vAlign w:val="center"/>
-          </w:tcPr>
-          <w:p>
-            <w:pPr>
-              <w:spacing w:line="276" w:lineRule="auto"/>
-              <w:rPr>
-                <w:sz w:val="24"/>
-              </w:rPr>
-            </w:pPr>
-            <w:r>
-              <w:rPr>
-                <w:rFonts w:ascii="Arial" w:hAnsi="Arial" w:eastAsia="宋体" w:cs="Arial"/>
-                <w:b/>
-                <w:bCs/>
-                <w:sz w:val="24"/>
-                <w:szCs w:val="18"/>
-              </w:rPr>
-              <w:t>仅脚本路径</w:t>
-            </w:r>
-          </w:p>
-        </w:tc>
-        <w:tc>
-          <w:tcPr>
-            <w:tcW w:w="1564" w:type="dxa"/>
-            <w:shd w:val="clear" w:color="auto" w:fill="D9D9D9"/>
-            <w:vAlign w:val="center"/>
-          </w:tcPr>
-          <w:p>
-            <w:pPr>
-              <w:spacing w:line="276" w:lineRule="auto"/>
-              <w:rPr>
-                <w:sz w:val="24"/>
-              </w:rPr>
-            </w:pPr>
-            <w:r>
-              <w:rPr>
-                <w:rFonts w:ascii="Arial" w:hAnsi="Arial" w:eastAsia="宋体" w:cs="Arial"/>
-                <w:b/>
-                <w:bCs/>
-                <w:sz w:val="24"/>
-                <w:szCs w:val="18"/>
-              </w:rPr>
-              <w:t>加权</w:t>
-            </w:r>
-          </w:p>
-        </w:tc>
-        <w:tc>
-          <w:tcPr>
-            <w:tcW w:w="1909" w:type="dxa"/>
-            <w:shd w:val="clear" w:color="auto" w:fill="D9D9D9"/>
-            <w:vAlign w:val="center"/>
-          </w:tcPr>
-          <w:p>
-            <w:pPr>
-              <w:spacing w:line="276" w:lineRule="auto"/>
-              <w:rPr>
-                <w:sz w:val="24"/>
-              </w:rPr>
-            </w:pPr>
-            <w:r>
-              <w:rPr>
-                <w:rFonts w:ascii="Arial" w:hAnsi="Arial" w:eastAsia="宋体" w:cs="Arial"/>
-                <w:b/>
-                <w:bCs/>
-                <w:sz w:val="24"/>
-                <w:szCs w:val="18"/>
-              </w:rPr>
-              <w:t>仅 ClawFlow 路径</w:t>
-            </w:r>
-          </w:p>
-        </w:tc>
-        <w:tc>
-          <w:tcPr>
-            <w:tcW w:w="1909" w:type="dxa"/>
-            <w:shd w:val="clear" w:color="auto" w:fill="D9D9D9"/>
-            <w:vAlign w:val="center"/>
-          </w:tcPr>
-          <w:p>
-            <w:pPr>
-              <w:spacing w:line="276" w:lineRule="auto"/>
-              <w:rPr>
-                <w:sz w:val="24"/>
-              </w:rPr>
-            </w:pPr>
-            <w:r>
-              <w:rPr>
-                <w:rFonts w:ascii="Arial" w:hAnsi="Arial" w:eastAsia="宋体" w:cs="Arial"/>
-                <w:b/>
-                <w:bCs/>
-                <w:sz w:val="24"/>
-                <w:szCs w:val="18"/>
-              </w:rPr>
-              <w:t>加权</w:t>
-            </w:r>
-          </w:p>
-        </w:tc>
-        <w:tc>
-          <w:tcPr>
-            <w:tcW w:w="1909" w:type="dxa"/>
-            <w:shd w:val="clear" w:color="auto" w:fill="D9D9D9"/>
-            <w:vAlign w:val="center"/>
-          </w:tcPr>
-          <w:p>
-            <w:pPr>
-              <w:spacing w:line="276" w:lineRule="auto"/>
-              <w:rPr>
-                <w:sz w:val="24"/>
-              </w:rPr>
-            </w:pPr>
-            <w:r>
-              <w:rPr>
-                <w:rFonts w:ascii="Arial" w:hAnsi="Arial" w:eastAsia="宋体" w:cs="Arial"/>
-                <w:b/>
-                <w:bCs/>
-                <w:sz w:val="24"/>
-                <w:szCs w:val="18"/>
-              </w:rPr>
-              <w:t>双路径并存</w:t>
-            </w:r>
-          </w:p>
-        </w:tc>
-        <w:tc>
-          <w:tcPr>
-            <w:tcW w:w="1909" w:type="dxa"/>
-            <w:shd w:val="clear" w:color="auto" w:fill="D9D9D9"/>
-            <w:vAlign w:val="center"/>
-          </w:tcPr>
-          <w:p>
-            <w:pPr>
-              <w:spacing w:line="276" w:lineRule="auto"/>
-              <w:rPr>
-                <w:sz w:val="24"/>
-              </w:rPr>
-            </w:pPr>
-            <w:r>
-              <w:rPr>
-                <w:rFonts w:ascii="Arial" w:hAnsi="Arial" w:eastAsia="宋体" w:cs="Arial"/>
-                <w:b/>
-                <w:bCs/>
-                <w:sz w:val="24"/>
-                <w:szCs w:val="18"/>
-              </w:rPr>
-              <w:t>加权</w:t>
-            </w:r>
-          </w:p>
-        </w:tc>
-      </w:tr>
-      <w:tr>
-        <w:trPr>
-          <w:trHeight w:val="645" w:hRule="atLeast"/>
-        </w:trPr>
-        <w:tc>
-          <w:tcPr>
-            <w:tcW w:w="2969" w:type="dxa"/>
-            <w:vAlign w:val="center"/>
-          </w:tcPr>
-          <w:p>
-            <w:pPr>
-              <w:spacing w:line="276" w:lineRule="auto"/>
-              <w:rPr>
-                <w:sz w:val="24"/>
-              </w:rPr>
-            </w:pPr>
-            <w:r>
-              <w:rPr>
-                <w:rFonts w:ascii="Arial" w:hAnsi="Arial" w:eastAsia="宋体" w:cs="Arial"/>
-                <w:sz w:val="24"/>
-                <w:szCs w:val="18"/>
-              </w:rPr>
-              <w:t>新场景上线速度</w:t>
-            </w:r>
-          </w:p>
-        </w:tc>
-        <w:tc>
-          <w:tcPr>
-            <w:tcW w:w="1344" w:type="dxa"/>
-            <w:vAlign w:val="center"/>
-          </w:tcPr>
-          <w:p>
-            <w:pPr>
-              <w:spacing w:line="276" w:lineRule="auto"/>
-              <w:rPr>
-                <w:sz w:val="24"/>
-              </w:rPr>
-            </w:pPr>
-            <w:r>
-              <w:rPr>
-                <w:rFonts w:ascii="Arial" w:hAnsi="Arial" w:eastAsia="宋体" w:cs="Arial"/>
-                <w:sz w:val="24"/>
-                <w:szCs w:val="18"/>
-              </w:rPr>
-              <w:t>30%</w:t>
-            </w:r>
-          </w:p>
-        </w:tc>
-        <w:tc>
-          <w:tcPr>
-            <w:tcW w:w="1759" w:type="dxa"/>
-            <w:vAlign w:val="center"/>
-          </w:tcPr>
-          <w:p>
-            <w:pPr>
-              <w:spacing w:line="276" w:lineRule="auto"/>
-              <w:rPr>
-                <w:sz w:val="24"/>
-              </w:rPr>
-            </w:pPr>
-            <w:r>
-              <w:rPr>
-                <w:rFonts w:ascii="Arial" w:hAnsi="Arial" w:eastAsia="宋体" w:cs="Arial"/>
-                <w:sz w:val="24"/>
-                <w:szCs w:val="18"/>
-              </w:rPr>
-              <w:t>5</w:t>
-            </w:r>
-          </w:p>
-        </w:tc>
-        <w:tc>
-          <w:tcPr>
-            <w:tcW w:w="1564" w:type="dxa"/>
-            <w:vAlign w:val="center"/>
-          </w:tcPr>
-          <w:p>
-            <w:pPr>
-              <w:spacing w:line="276" w:lineRule="auto"/>
-              <w:rPr>
-                <w:sz w:val="24"/>
-              </w:rPr>
-            </w:pPr>
-            <w:r>
-              <w:rPr>
-                <w:rFonts w:ascii="Arial" w:hAnsi="Arial" w:eastAsia="宋体" w:cs="Arial"/>
-                <w:sz w:val="24"/>
-                <w:szCs w:val="18"/>
-              </w:rPr>
-              <w:t>1.50</w:t>
-            </w:r>
-          </w:p>
-        </w:tc>
-        <w:tc>
-          <w:tcPr>
-            <w:tcW w:w="1909" w:type="dxa"/>
-            <w:vAlign w:val="center"/>
-          </w:tcPr>
-          <w:p>
-            <w:pPr>
-              <w:spacing w:line="276" w:lineRule="auto"/>
-              <w:rPr>
-                <w:sz w:val="24"/>
-              </w:rPr>
-            </w:pPr>
-            <w:r>
-              <w:rPr>
-                <w:rFonts w:ascii="Arial" w:hAnsi="Arial" w:eastAsia="宋体" w:cs="Arial"/>
-                <w:sz w:val="24"/>
-                <w:szCs w:val="18"/>
-              </w:rPr>
-              <w:t>2</w:t>
-            </w:r>
-          </w:p>
-        </w:tc>
-        <w:tc>
-          <w:tcPr>
-            <w:tcW w:w="1909" w:type="dxa"/>
-            <w:vAlign w:val="center"/>
-          </w:tcPr>
-          <w:p>
-            <w:pPr>
-              <w:spacing w:line="276" w:lineRule="auto"/>
-              <w:rPr>
-                <w:sz w:val="24"/>
-              </w:rPr>
-            </w:pPr>
-            <w:r>
-              <w:rPr>
-                <w:rFonts w:ascii="Arial" w:hAnsi="Arial" w:eastAsia="宋体" w:cs="Arial"/>
-                <w:sz w:val="24"/>
-                <w:szCs w:val="18"/>
-              </w:rPr>
-              <w:t>0.60</w:t>
-            </w:r>
-          </w:p>
-        </w:tc>
-        <w:tc>
-          <w:tcPr>
-            <w:tcW w:w="1909" w:type="dxa"/>
-            <w:vAlign w:val="center"/>
-          </w:tcPr>
-          <w:p>
-            <w:pPr>
-              <w:spacing w:line="276" w:lineRule="auto"/>
-              <w:rPr>
-                <w:sz w:val="24"/>
-              </w:rPr>
-            </w:pPr>
-            <w:r>
-              <w:rPr>
-                <w:rFonts w:ascii="Arial" w:hAnsi="Arial" w:eastAsia="宋体" w:cs="Arial"/>
-                <w:sz w:val="24"/>
-                <w:szCs w:val="18"/>
-              </w:rPr>
-              <w:t>5</w:t>
-            </w:r>
-          </w:p>
-        </w:tc>
-        <w:tc>
-          <w:tcPr>
-            <w:tcW w:w="1909" w:type="dxa"/>
-            <w:vAlign w:val="center"/>
-          </w:tcPr>
-          <w:p>
-            <w:pPr>
-              <w:spacing w:line="276" w:lineRule="auto"/>
-              <w:rPr>
-                <w:sz w:val="24"/>
-              </w:rPr>
-            </w:pPr>
-            <w:r>
-              <w:rPr>
-                <w:rFonts w:ascii="Arial" w:hAnsi="Arial" w:eastAsia="宋体" w:cs="Arial"/>
-                <w:sz w:val="24"/>
-                <w:szCs w:val="18"/>
-              </w:rPr>
-              <w:t>1.50</w:t>
-            </w:r>
-          </w:p>
-        </w:tc>
-      </w:tr>
-      <w:tr>
-        <w:trPr>
-          <w:trHeight w:val="645" w:hRule="atLeast"/>
-        </w:trPr>
-        <w:tc>
-          <w:tcPr>
-            <w:tcW w:w="2969" w:type="dxa"/>
-            <w:vAlign w:val="center"/>
-          </w:tcPr>
-          <w:p>
-            <w:pPr>
-              <w:spacing w:line="276" w:lineRule="auto"/>
-              <w:rPr>
-                <w:sz w:val="24"/>
-              </w:rPr>
-            </w:pPr>
-            <w:r>
-              <w:rPr>
-                <w:rFonts w:ascii="Arial" w:hAnsi="Arial" w:eastAsia="宋体" w:cs="Arial"/>
-                <w:sz w:val="24"/>
-                <w:szCs w:val="18"/>
-              </w:rPr>
-              <w:t>长任务可恢复/可补偿</w:t>
-            </w:r>
-          </w:p>
-        </w:tc>
-        <w:tc>
-          <w:tcPr>
-            <w:tcW w:w="1344" w:type="dxa"/>
-            <w:vAlign w:val="center"/>
-          </w:tcPr>
-          <w:p>
-            <w:pPr>
-              <w:spacing w:line="276" w:lineRule="auto"/>
-              <w:rPr>
-                <w:sz w:val="24"/>
-              </w:rPr>
-            </w:pPr>
-            <w:r>
-              <w:rPr>
-                <w:rFonts w:ascii="Arial" w:hAnsi="Arial" w:eastAsia="宋体" w:cs="Arial"/>
-                <w:sz w:val="24"/>
-                <w:szCs w:val="18"/>
-              </w:rPr>
-              <w:t>25%</w:t>
-            </w:r>
-          </w:p>
-        </w:tc>
-        <w:tc>
-          <w:tcPr>
-            <w:tcW w:w="1759" w:type="dxa"/>
-            <w:vAlign w:val="center"/>
-          </w:tcPr>
-          <w:p>
-            <w:pPr>
-              <w:spacing w:line="276" w:lineRule="auto"/>
-              <w:rPr>
-                <w:sz w:val="24"/>
-              </w:rPr>
-            </w:pPr>
-            <w:r>
-              <w:rPr>
-                <w:rFonts w:ascii="Arial" w:hAnsi="Arial" w:eastAsia="宋体" w:cs="Arial"/>
-                <w:sz w:val="24"/>
-                <w:szCs w:val="18"/>
-              </w:rPr>
-              <w:t>2</w:t>
-            </w:r>
-          </w:p>
-        </w:tc>
-        <w:tc>
-          <w:tcPr>
-            <w:tcW w:w="1564" w:type="dxa"/>
-            <w:vAlign w:val="center"/>
-          </w:tcPr>
-          <w:p>
-            <w:pPr>
-              <w:spacing w:line="276" w:lineRule="auto"/>
-              <w:rPr>
-                <w:sz w:val="24"/>
-              </w:rPr>
-            </w:pPr>
-            <w:r>
-              <w:rPr>
-                <w:rFonts w:ascii="Arial" w:hAnsi="Arial" w:eastAsia="宋体" w:cs="Arial"/>
-                <w:sz w:val="24"/>
-                <w:szCs w:val="18"/>
-              </w:rPr>
-              <w:t>0.50</w:t>
-            </w:r>
-          </w:p>
-        </w:tc>
-        <w:tc>
-          <w:tcPr>
-            <w:tcW w:w="1909" w:type="dxa"/>
-            <w:vAlign w:val="center"/>
-          </w:tcPr>
-          <w:p>
-            <w:pPr>
-              <w:spacing w:line="276" w:lineRule="auto"/>
-              <w:rPr>
-                <w:sz w:val="24"/>
-              </w:rPr>
-            </w:pPr>
-            <w:r>
-              <w:rPr>
-                <w:rFonts w:ascii="Arial" w:hAnsi="Arial" w:eastAsia="宋体" w:cs="Arial"/>
-                <w:sz w:val="24"/>
-                <w:szCs w:val="18"/>
-              </w:rPr>
-              <w:t>5</w:t>
-            </w:r>
-          </w:p>
-        </w:tc>
-        <w:tc>
-          <w:tcPr>
-            <w:tcW w:w="1909" w:type="dxa"/>
-            <w:vAlign w:val="center"/>
-          </w:tcPr>
-          <w:p>
-            <w:pPr>
-              <w:spacing w:line="276" w:lineRule="auto"/>
-              <w:rPr>
-                <w:sz w:val="24"/>
-              </w:rPr>
-            </w:pPr>
-            <w:r>
-              <w:rPr>
-                <w:rFonts w:ascii="Arial" w:hAnsi="Arial" w:eastAsia="宋体" w:cs="Arial"/>
-                <w:sz w:val="24"/>
-                <w:szCs w:val="18"/>
-              </w:rPr>
-              <w:t>1.25</w:t>
-            </w:r>
-          </w:p>
-        </w:tc>
-        <w:tc>
-          <w:tcPr>
-            <w:tcW w:w="1909" w:type="dxa"/>
-            <w:vAlign w:val="center"/>
-          </w:tcPr>
-          <w:p>
-            <w:pPr>
-              <w:spacing w:line="276" w:lineRule="auto"/>
-              <w:rPr>
-                <w:sz w:val="24"/>
-              </w:rPr>
-            </w:pPr>
-            <w:r>
-              <w:rPr>
-                <w:rFonts w:ascii="Arial" w:hAnsi="Arial" w:eastAsia="宋体" w:cs="Arial"/>
-                <w:sz w:val="24"/>
-                <w:szCs w:val="18"/>
-              </w:rPr>
-              <w:t>5</w:t>
-            </w:r>
-          </w:p>
-        </w:tc>
-        <w:tc>
-          <w:tcPr>
-            <w:tcW w:w="1909" w:type="dxa"/>
-            <w:vAlign w:val="center"/>
-          </w:tcPr>
-          <w:p>
-            <w:pPr>
-              <w:spacing w:line="276" w:lineRule="auto"/>
-              <w:rPr>
-                <w:sz w:val="24"/>
-              </w:rPr>
-            </w:pPr>
-            <w:r>
-              <w:rPr>
-                <w:rFonts w:ascii="Arial" w:hAnsi="Arial" w:eastAsia="宋体" w:cs="Arial"/>
-                <w:sz w:val="24"/>
-                <w:szCs w:val="18"/>
-              </w:rPr>
-              <w:t>1.25</w:t>
-            </w:r>
-          </w:p>
-        </w:tc>
-      </w:tr>
-      <w:tr>
-        <w:trPr>
-          <w:trHeight w:val="645" w:hRule="atLeast"/>
-        </w:trPr>
-        <w:tc>
-          <w:tcPr>
-            <w:tcW w:w="2969" w:type="dxa"/>
-            <w:vAlign w:val="center"/>
-          </w:tcPr>
-          <w:p>
-            <w:pPr>
-              <w:spacing w:line="276" w:lineRule="auto"/>
-              <w:rPr>
-                <w:sz w:val="24"/>
-              </w:rPr>
-            </w:pPr>
-            <w:r>
-              <w:rPr>
-                <w:rFonts w:ascii="Arial" w:hAnsi="Arial" w:eastAsia="宋体" w:cs="Arial"/>
-                <w:sz w:val="24"/>
-                <w:szCs w:val="18"/>
-              </w:rPr>
-              <w:t>能力复用与审计</w:t>
-            </w:r>
-          </w:p>
-        </w:tc>
-        <w:tc>
-          <w:tcPr>
-            <w:tcW w:w="1344" w:type="dxa"/>
-            <w:vAlign w:val="center"/>
-          </w:tcPr>
-          <w:p>
-            <w:pPr>
-              <w:spacing w:line="276" w:lineRule="auto"/>
-              <w:rPr>
-                <w:sz w:val="24"/>
-              </w:rPr>
-            </w:pPr>
-            <w:r>
-              <w:rPr>
-                <w:rFonts w:ascii="Arial" w:hAnsi="Arial" w:eastAsia="宋体" w:cs="Arial"/>
-                <w:sz w:val="24"/>
-                <w:szCs w:val="18"/>
-              </w:rPr>
-              <w:t>20%</w:t>
-            </w:r>
-          </w:p>
-        </w:tc>
-        <w:tc>
-          <w:tcPr>
-            <w:tcW w:w="1759" w:type="dxa"/>
-            <w:vAlign w:val="center"/>
-          </w:tcPr>
-          <w:p>
-            <w:pPr>
-              <w:spacing w:line="276" w:lineRule="auto"/>
-              <w:rPr>
-                <w:sz w:val="24"/>
-              </w:rPr>
-            </w:pPr>
-            <w:r>
-              <w:rPr>
-                <w:rFonts w:ascii="Arial" w:hAnsi="Arial" w:eastAsia="宋体" w:cs="Arial"/>
-                <w:sz w:val="24"/>
-                <w:szCs w:val="18"/>
-              </w:rPr>
-              <w:t>2</w:t>
-            </w:r>
-          </w:p>
-        </w:tc>
-        <w:tc>
-          <w:tcPr>
-            <w:tcW w:w="1564" w:type="dxa"/>
-            <w:vAlign w:val="center"/>
-          </w:tcPr>
-          <w:p>
-            <w:pPr>
-              <w:spacing w:line="276" w:lineRule="auto"/>
-              <w:rPr>
-                <w:sz w:val="24"/>
-              </w:rPr>
-            </w:pPr>
-            <w:r>
-              <w:rPr>
-                <w:rFonts w:ascii="Arial" w:hAnsi="Arial" w:eastAsia="宋体" w:cs="Arial"/>
-                <w:sz w:val="24"/>
-                <w:szCs w:val="18"/>
-              </w:rPr>
-              <w:t>0.40</w:t>
-            </w:r>
-          </w:p>
-        </w:tc>
-        <w:tc>
-          <w:tcPr>
-            <w:tcW w:w="1909" w:type="dxa"/>
-            <w:vAlign w:val="center"/>
-          </w:tcPr>
-          <w:p>
-            <w:pPr>
-              <w:spacing w:line="276" w:lineRule="auto"/>
-              <w:rPr>
-                <w:sz w:val="24"/>
-              </w:rPr>
-            </w:pPr>
-            <w:r>
-              <w:rPr>
-                <w:rFonts w:ascii="Arial" w:hAnsi="Arial" w:eastAsia="宋体" w:cs="Arial"/>
-                <w:sz w:val="24"/>
-                <w:szCs w:val="18"/>
-              </w:rPr>
-              <w:t>5</w:t>
-            </w:r>
-          </w:p>
-        </w:tc>
-        <w:tc>
-          <w:tcPr>
-            <w:tcW w:w="1909" w:type="dxa"/>
-            <w:vAlign w:val="center"/>
-          </w:tcPr>
-          <w:p>
-            <w:pPr>
-              <w:spacing w:line="276" w:lineRule="auto"/>
-              <w:rPr>
-                <w:sz w:val="24"/>
-              </w:rPr>
-            </w:pPr>
-            <w:r>
-              <w:rPr>
-                <w:rFonts w:ascii="Arial" w:hAnsi="Arial" w:eastAsia="宋体" w:cs="Arial"/>
-                <w:sz w:val="24"/>
-                <w:szCs w:val="18"/>
-              </w:rPr>
-              <w:t>1.00</w:t>
-            </w:r>
-          </w:p>
-        </w:tc>
-        <w:tc>
-          <w:tcPr>
-            <w:tcW w:w="1909" w:type="dxa"/>
-            <w:vAlign w:val="center"/>
-          </w:tcPr>
-          <w:p>
-            <w:pPr>
-              <w:spacing w:line="276" w:lineRule="auto"/>
-              <w:rPr>
-                <w:sz w:val="24"/>
-              </w:rPr>
-            </w:pPr>
-            <w:r>
-              <w:rPr>
-                <w:rFonts w:ascii="Arial" w:hAnsi="Arial" w:eastAsia="宋体" w:cs="Arial"/>
-                <w:sz w:val="24"/>
-                <w:szCs w:val="18"/>
-              </w:rPr>
-              <w:t>5</w:t>
-            </w:r>
-          </w:p>
-        </w:tc>
-        <w:tc>
-          <w:tcPr>
-            <w:tcW w:w="1909" w:type="dxa"/>
-            <w:vAlign w:val="center"/>
-          </w:tcPr>
-          <w:p>
-            <w:pPr>
-              <w:spacing w:line="276" w:lineRule="auto"/>
-              <w:rPr>
-                <w:sz w:val="24"/>
-              </w:rPr>
-            </w:pPr>
-            <w:r>
-              <w:rPr>
-                <w:rFonts w:ascii="Arial" w:hAnsi="Arial" w:eastAsia="宋体" w:cs="Arial"/>
-                <w:sz w:val="24"/>
-                <w:szCs w:val="18"/>
-              </w:rPr>
-              <w:t>1.00</w:t>
-            </w:r>
-          </w:p>
-        </w:tc>
-      </w:tr>
-      <w:tr>
-        <w:trPr>
-          <w:trHeight w:val="645" w:hRule="atLeast"/>
-        </w:trPr>
-        <w:tc>
-          <w:tcPr>
-            <w:tcW w:w="2969" w:type="dxa"/>
-            <w:vAlign w:val="center"/>
-          </w:tcPr>
-          <w:p>
-            <w:pPr>
-              <w:spacing w:line="276" w:lineRule="auto"/>
-              <w:rPr>
-                <w:sz w:val="24"/>
-              </w:rPr>
-            </w:pPr>
-            <w:r>
-              <w:rPr>
-                <w:rFonts w:ascii="Arial" w:hAnsi="Arial" w:eastAsia="宋体" w:cs="Arial"/>
-                <w:sz w:val="24"/>
-                <w:szCs w:val="18"/>
-              </w:rPr>
-              <w:t>运行时资源（浏览器等）</w:t>
-            </w:r>
-          </w:p>
-        </w:tc>
-        <w:tc>
-          <w:tcPr>
-            <w:tcW w:w="1344" w:type="dxa"/>
-            <w:vAlign w:val="center"/>
-          </w:tcPr>
-          <w:p>
-            <w:pPr>
-              <w:spacing w:line="276" w:lineRule="auto"/>
-              <w:rPr>
-                <w:sz w:val="24"/>
-              </w:rPr>
-            </w:pPr>
-            <w:r>
-              <w:rPr>
-                <w:rFonts w:ascii="Arial" w:hAnsi="Arial" w:eastAsia="宋体" w:cs="Arial"/>
-                <w:sz w:val="24"/>
-                <w:szCs w:val="18"/>
-              </w:rPr>
-              <w:t>15%</w:t>
-            </w:r>
-          </w:p>
-        </w:tc>
-        <w:tc>
-          <w:tcPr>
-            <w:tcW w:w="1759" w:type="dxa"/>
-            <w:vAlign w:val="center"/>
-          </w:tcPr>
-          <w:p>
-            <w:pPr>
-              <w:spacing w:line="276" w:lineRule="auto"/>
-              <w:rPr>
-                <w:sz w:val="24"/>
-              </w:rPr>
-            </w:pPr>
-            <w:r>
-              <w:rPr>
-                <w:rFonts w:ascii="Arial" w:hAnsi="Arial" w:eastAsia="宋体" w:cs="Arial"/>
-                <w:sz w:val="24"/>
-                <w:szCs w:val="18"/>
-              </w:rPr>
-              <w:t>2</w:t>
-            </w:r>
-          </w:p>
-        </w:tc>
-        <w:tc>
-          <w:tcPr>
-            <w:tcW w:w="1564" w:type="dxa"/>
-            <w:vAlign w:val="center"/>
-          </w:tcPr>
-          <w:p>
-            <w:pPr>
-              <w:spacing w:line="276" w:lineRule="auto"/>
-              <w:rPr>
-                <w:sz w:val="24"/>
-              </w:rPr>
-            </w:pPr>
-            <w:r>
-              <w:rPr>
-                <w:rFonts w:ascii="Arial" w:hAnsi="Arial" w:eastAsia="宋体" w:cs="Arial"/>
-                <w:sz w:val="24"/>
-                <w:szCs w:val="18"/>
-              </w:rPr>
-              <w:t>0.30</w:t>
-            </w:r>
-          </w:p>
-        </w:tc>
-        <w:tc>
-          <w:tcPr>
-            <w:tcW w:w="1909" w:type="dxa"/>
-            <w:vAlign w:val="center"/>
-          </w:tcPr>
-          <w:p>
-            <w:pPr>
-              <w:spacing w:line="276" w:lineRule="auto"/>
-              <w:rPr>
-                <w:sz w:val="24"/>
-              </w:rPr>
-            </w:pPr>
-            <w:r>
-              <w:rPr>
-                <w:rFonts w:ascii="Arial" w:hAnsi="Arial" w:eastAsia="宋体" w:cs="Arial"/>
-                <w:sz w:val="24"/>
-                <w:szCs w:val="18"/>
-              </w:rPr>
-              <w:t>5</w:t>
-            </w:r>
-          </w:p>
-        </w:tc>
-        <w:tc>
-          <w:tcPr>
-            <w:tcW w:w="1909" w:type="dxa"/>
-            <w:vAlign w:val="center"/>
-          </w:tcPr>
-          <w:p>
-            <w:pPr>
-              <w:spacing w:line="276" w:lineRule="auto"/>
-              <w:rPr>
-                <w:sz w:val="24"/>
-              </w:rPr>
-            </w:pPr>
-            <w:r>
-              <w:rPr>
-                <w:rFonts w:ascii="Arial" w:hAnsi="Arial" w:eastAsia="宋体" w:cs="Arial"/>
-                <w:sz w:val="24"/>
-                <w:szCs w:val="18"/>
-              </w:rPr>
-              <w:t>0.75</w:t>
-            </w:r>
-          </w:p>
-        </w:tc>
-        <w:tc>
-          <w:tcPr>
-            <w:tcW w:w="1909" w:type="dxa"/>
-            <w:vAlign w:val="center"/>
-          </w:tcPr>
-          <w:p>
-            <w:pPr>
-              <w:spacing w:line="276" w:lineRule="auto"/>
-              <w:rPr>
-                <w:sz w:val="24"/>
-              </w:rPr>
-            </w:pPr>
-            <w:r>
-              <w:rPr>
-                <w:rFonts w:ascii="Arial" w:hAnsi="Arial" w:eastAsia="宋体" w:cs="Arial"/>
-                <w:sz w:val="24"/>
-                <w:szCs w:val="18"/>
-              </w:rPr>
-              <w:t>4</w:t>
-            </w:r>
-          </w:p>
-        </w:tc>
-        <w:tc>
-          <w:tcPr>
-            <w:tcW w:w="1909" w:type="dxa"/>
-            <w:vAlign w:val="center"/>
-          </w:tcPr>
-          <w:p>
-            <w:pPr>
-              <w:spacing w:line="276" w:lineRule="auto"/>
-              <w:rPr>
-                <w:sz w:val="24"/>
-              </w:rPr>
-            </w:pPr>
-            <w:r>
-              <w:rPr>
-                <w:rFonts w:ascii="Arial" w:hAnsi="Arial" w:eastAsia="宋体" w:cs="Arial"/>
-                <w:sz w:val="24"/>
-                <w:szCs w:val="18"/>
-              </w:rPr>
-              <w:t>0.60</w:t>
-            </w:r>
-          </w:p>
-        </w:tc>
-      </w:tr>
-      <w:tr>
-        <w:trPr>
-          <w:trHeight w:val="645" w:hRule="atLeast"/>
-        </w:trPr>
-        <w:tc>
-          <w:tcPr>
-            <w:tcW w:w="2969" w:type="dxa"/>
-            <w:vAlign w:val="center"/>
-          </w:tcPr>
-          <w:p>
-            <w:pPr>
-              <w:spacing w:line="276" w:lineRule="auto"/>
-              <w:rPr>
-                <w:sz w:val="24"/>
-              </w:rPr>
-            </w:pPr>
-            <w:r>
-              <w:rPr>
-                <w:rFonts w:ascii="Arial" w:hAnsi="Arial" w:eastAsia="宋体" w:cs="Arial"/>
-                <w:sz w:val="24"/>
-                <w:szCs w:val="18"/>
-              </w:rPr>
-              <w:t>工程与运维复杂度</w:t>
-            </w:r>
-          </w:p>
-        </w:tc>
-        <w:tc>
-          <w:tcPr>
-            <w:tcW w:w="1344" w:type="dxa"/>
-            <w:vAlign w:val="center"/>
-          </w:tcPr>
-          <w:p>
-            <w:pPr>
-              <w:spacing w:line="276" w:lineRule="auto"/>
-              <w:rPr>
-                <w:sz w:val="24"/>
-              </w:rPr>
-            </w:pPr>
-            <w:r>
-              <w:rPr>
-                <w:rFonts w:ascii="Arial" w:hAnsi="Arial" w:eastAsia="宋体" w:cs="Arial"/>
-                <w:sz w:val="24"/>
-                <w:szCs w:val="18"/>
-              </w:rPr>
-              <w:t>10%</w:t>
-            </w:r>
-          </w:p>
-        </w:tc>
-        <w:tc>
-          <w:tcPr>
-            <w:tcW w:w="1759" w:type="dxa"/>
-            <w:vAlign w:val="center"/>
-          </w:tcPr>
-          <w:p>
-            <w:pPr>
-              <w:spacing w:line="276" w:lineRule="auto"/>
-              <w:rPr>
-                <w:sz w:val="24"/>
-              </w:rPr>
-            </w:pPr>
-            <w:r>
-              <w:rPr>
-                <w:rFonts w:ascii="Arial" w:hAnsi="Arial" w:eastAsia="宋体" w:cs="Arial"/>
-                <w:sz w:val="24"/>
-                <w:szCs w:val="18"/>
-              </w:rPr>
-              <w:t>5</w:t>
-            </w:r>
-          </w:p>
-        </w:tc>
-        <w:tc>
-          <w:tcPr>
-            <w:tcW w:w="1564" w:type="dxa"/>
-            <w:vAlign w:val="center"/>
-          </w:tcPr>
-          <w:p>
-            <w:pPr>
-              <w:spacing w:line="276" w:lineRule="auto"/>
-              <w:rPr>
-                <w:sz w:val="24"/>
-              </w:rPr>
-            </w:pPr>
-            <w:r>
-              <w:rPr>
-                <w:rFonts w:ascii="Arial" w:hAnsi="Arial" w:eastAsia="宋体" w:cs="Arial"/>
-                <w:sz w:val="24"/>
-                <w:szCs w:val="18"/>
-              </w:rPr>
-              <w:t>0.50</w:t>
-            </w:r>
-          </w:p>
-        </w:tc>
-        <w:tc>
-          <w:tcPr>
-            <w:tcW w:w="1909" w:type="dxa"/>
-            <w:vAlign w:val="center"/>
-          </w:tcPr>
-          <w:p>
-            <w:pPr>
-              <w:spacing w:line="276" w:lineRule="auto"/>
-              <w:rPr>
-                <w:sz w:val="24"/>
-              </w:rPr>
-            </w:pPr>
-            <w:r>
-              <w:rPr>
-                <w:rFonts w:ascii="Arial" w:hAnsi="Arial" w:eastAsia="宋体" w:cs="Arial"/>
-                <w:sz w:val="24"/>
-                <w:szCs w:val="18"/>
-              </w:rPr>
-              <w:t>3</w:t>
-            </w:r>
-          </w:p>
-        </w:tc>
-        <w:tc>
-          <w:tcPr>
-            <w:tcW w:w="1909" w:type="dxa"/>
-            <w:vAlign w:val="center"/>
-          </w:tcPr>
-          <w:p>
-            <w:pPr>
-              <w:spacing w:line="276" w:lineRule="auto"/>
-              <w:rPr>
-                <w:sz w:val="24"/>
-              </w:rPr>
-            </w:pPr>
-            <w:r>
-              <w:rPr>
-                <w:rFonts w:ascii="Arial" w:hAnsi="Arial" w:eastAsia="宋体" w:cs="Arial"/>
-                <w:sz w:val="24"/>
-                <w:szCs w:val="18"/>
-              </w:rPr>
-              <w:t>0.30</w:t>
-            </w:r>
-          </w:p>
-        </w:tc>
-        <w:tc>
-          <w:tcPr>
-            <w:tcW w:w="1909" w:type="dxa"/>
-            <w:vAlign w:val="center"/>
-          </w:tcPr>
-          <w:p>
-            <w:pPr>
-              <w:spacing w:line="276" w:lineRule="auto"/>
-              <w:rPr>
-                <w:sz w:val="24"/>
-              </w:rPr>
-            </w:pPr>
-            <w:r>
-              <w:rPr>
-                <w:rFonts w:ascii="Arial" w:hAnsi="Arial" w:eastAsia="宋体" w:cs="Arial"/>
-                <w:sz w:val="24"/>
-                <w:szCs w:val="18"/>
-              </w:rPr>
-              <w:t>3</w:t>
-            </w:r>
-          </w:p>
-        </w:tc>
-        <w:tc>
-          <w:tcPr>
-            <w:tcW w:w="1909" w:type="dxa"/>
-            <w:vAlign w:val="center"/>
-          </w:tcPr>
-          <w:p>
-            <w:pPr>
-              <w:spacing w:line="276" w:lineRule="auto"/>
-              <w:rPr>
-                <w:sz w:val="24"/>
-              </w:rPr>
-            </w:pPr>
-            <w:r>
-              <w:rPr>
-                <w:rFonts w:ascii="Arial" w:hAnsi="Arial" w:eastAsia="宋体" w:cs="Arial"/>
-                <w:sz w:val="24"/>
-                <w:szCs w:val="18"/>
-              </w:rPr>
-              <w:t>0.30</w:t>
-            </w:r>
-          </w:p>
-        </w:tc>
-      </w:tr>
-      <w:tr>
-        <w:trPr>
-          <w:trHeight w:val="645" w:hRule="atLeast"/>
-        </w:trPr>
-        <w:tc>
-          <w:tcPr>
-            <w:tcW w:w="2969" w:type="dxa"/>
-            <w:vAlign w:val="center"/>
-          </w:tcPr>
-          <w:p>
-            <w:pPr>
-              <w:spacing w:line="276" w:lineRule="auto"/>
-              <w:rPr>
-                <w:sz w:val="24"/>
-              </w:rPr>
-            </w:pPr>
-            <w:r>
-              <w:rPr>
-                <w:rFonts w:ascii="Arial" w:hAnsi="Arial" w:eastAsia="宋体" w:cs="Arial"/>
-                <w:sz w:val="24"/>
-                <w:szCs w:val="18"/>
-              </w:rPr>
-              <w:t>合计</w:t>
-            </w:r>
-          </w:p>
-        </w:tc>
-        <w:tc>
-          <w:tcPr>
-            <w:tcW w:w="1344" w:type="dxa"/>
-            <w:vAlign w:val="center"/>
-          </w:tcPr>
-          <w:p>
-            <w:pPr>
-              <w:spacing w:line="276" w:lineRule="auto"/>
-              <w:rPr>
-                <w:sz w:val="24"/>
-              </w:rPr>
-            </w:pPr>
-          </w:p>
-        </w:tc>
-        <w:tc>
-          <w:tcPr>
-            <w:tcW w:w="1759" w:type="dxa"/>
-            <w:vAlign w:val="center"/>
-          </w:tcPr>
-          <w:p>
-            <w:pPr>
-              <w:spacing w:line="276" w:lineRule="auto"/>
-              <w:rPr>
-                <w:sz w:val="24"/>
-              </w:rPr>
-            </w:pPr>
-          </w:p>
-        </w:tc>
-        <w:tc>
-          <w:tcPr>
-            <w:tcW w:w="1564" w:type="dxa"/>
-            <w:vAlign w:val="center"/>
-          </w:tcPr>
-          <w:p>
-            <w:pPr>
-              <w:spacing w:line="276" w:lineRule="auto"/>
-              <w:rPr>
-                <w:sz w:val="24"/>
-              </w:rPr>
-            </w:pPr>
-            <w:r>
-              <w:rPr>
-                <w:rFonts w:ascii="Arial" w:hAnsi="Arial" w:eastAsia="宋体" w:cs="Arial"/>
-                <w:sz w:val="24"/>
-                <w:szCs w:val="18"/>
-              </w:rPr>
-              <w:t>3.20</w:t>
-            </w:r>
-          </w:p>
-        </w:tc>
-        <w:tc>
-          <w:tcPr>
-            <w:tcW w:w="1909" w:type="dxa"/>
-            <w:vAlign w:val="center"/>
-          </w:tcPr>
-          <w:p>
-            <w:pPr>
-              <w:spacing w:line="276" w:lineRule="auto"/>
-              <w:rPr>
-                <w:sz w:val="24"/>
-              </w:rPr>
-            </w:pPr>
-          </w:p>
-        </w:tc>
-        <w:tc>
-          <w:tcPr>
-            <w:tcW w:w="1909" w:type="dxa"/>
-            <w:vAlign w:val="center"/>
-          </w:tcPr>
-          <w:p>
-            <w:pPr>
-              <w:spacing w:line="276" w:lineRule="auto"/>
-              <w:rPr>
-                <w:sz w:val="24"/>
-              </w:rPr>
-            </w:pPr>
-            <w:r>
-              <w:rPr>
-                <w:rFonts w:ascii="Arial" w:hAnsi="Arial" w:eastAsia="宋体" w:cs="Arial"/>
-                <w:sz w:val="24"/>
-                <w:szCs w:val="18"/>
-              </w:rPr>
-              <w:t>3.90</w:t>
-            </w:r>
-          </w:p>
-        </w:tc>
-        <w:tc>
-          <w:tcPr>
-            <w:tcW w:w="1909" w:type="dxa"/>
-            <w:vAlign w:val="center"/>
-          </w:tcPr>
-          <w:p>
-            <w:pPr>
-              <w:spacing w:line="276" w:lineRule="auto"/>
-              <w:rPr>
-                <w:sz w:val="24"/>
-              </w:rPr>
-            </w:pPr>
-          </w:p>
-        </w:tc>
-        <w:tc>
-          <w:tcPr>
-            <w:tcW w:w="1909" w:type="dxa"/>
-            <w:vAlign w:val="center"/>
-          </w:tcPr>
-          <w:p>
-            <w:pPr>
-              <w:spacing w:line="276" w:lineRule="auto"/>
-              <w:rPr>
-                <w:sz w:val="24"/>
-              </w:rPr>
-            </w:pPr>
-            <w:r>
-              <w:rPr>
-                <w:rFonts w:ascii="Arial" w:hAnsi="Arial" w:eastAsia="宋体" w:cs="Arial"/>
-                <w:sz w:val="24"/>
-                <w:szCs w:val="18"/>
-              </w:rPr>
-              <w:t>4.65</w:t>
-            </w:r>
-          </w:p>
-        </w:tc>
-      </w:tr>
-    </w:tbl>
-    <w:p>
-      <w:pPr>
-        <w:spacing w:line="360" w:lineRule="auto"/>
-        <w:rPr/>
-      </w:pPr>
-    </w:p>
-    <w:tbl>
-      <w:tblPr>
-        <w:tblStyle w:val="000012"/>
-        <w:tblW w:w="0" w:type="auto"/>
-        <w:tblInd w:w="0" w:type="dxa"/>
-        <w:tblBorders>
-          <w:top w:val="single" w:color="auto" w:sz="4" w:space="0"/>
-          <w:left w:val="single" w:color="auto" w:sz="4" w:space="0"/>
-          <w:bottom w:val="single" w:color="auto" w:sz="4" w:space="0"/>
-          <w:right w:val="single" w:color="auto" w:sz="4" w:space="0"/>
-          <w:insideH w:val="single" w:color="auto" w:sz="4" w:space="0"/>
-          <w:insideV w:val="single" w:color="auto" w:sz="4" w:space="0"/>
-        </w:tblBorders>
-        <w:tblLayout w:type="fixed"/>
-        <w:tblCellMar>
-          <w:top w:w="0" w:type="dxa"/>
-          <w:left w:w="108" w:type="dxa"/>
-          <w:bottom w:w="0" w:type="dxa"/>
-          <w:right w:w="108" w:type="dxa"/>
-        </w:tblCellMar>
-      </w:tblPr>
-      <w:tblGrid>
-        <w:gridCol w:w="2858"/>
-        <w:gridCol w:w="4133"/>
-        <w:gridCol w:w="4463"/>
-        <w:gridCol w:w="3818"/>
+        <w:gridCol w:w="2600"/>
+        <w:gridCol w:w="4700"/>
+        <w:gridCol w:w="5200"/>
+        <w:gridCol w:w="2774"/>
       </w:tblGrid>
       <w:tr>
         <w:trPr>
@@ -9264,7 +7735,7 @@
         </w:trPr>
         <w:tc>
           <w:tcPr>
-            <w:tcW w:w="2858" w:type="dxa"/>
+            <w:tcW w:w="2600" w:type="dxa"/>
             <w:shd w:val="clear" w:color="auto" w:fill="D9D9D9"/>
             <w:vAlign w:val="center"/>
           </w:tcPr>
@@ -9289,7 +7760,7 @@
         </w:tc>
         <w:tc>
           <w:tcPr>
-            <w:tcW w:w="4133" w:type="dxa"/>
+            <w:tcW w:w="4700" w:type="dxa"/>
             <w:shd w:val="clear" w:color="auto" w:fill="D9D9D9"/>
             <w:vAlign w:val="center"/>
           </w:tcPr>
@@ -9308,13 +7779,13 @@
                 <w:sz w:val="24"/>
                 <w:szCs w:val="18"/>
               </w:rPr>
-              <w:t>优点</w:t>
-            </w:r>
-          </w:p>
-        </w:tc>
-        <w:tc>
-          <w:tcPr>
-            <w:tcW w:w="4463" w:type="dxa"/>
+              <w:t>说明</w:t>
+            </w:r>
+          </w:p>
+        </w:tc>
+        <w:tc>
+          <w:tcPr>
+            <w:tcW w:w="5200" w:type="dxa"/>
             <w:shd w:val="clear" w:color="auto" w:fill="D9D9D9"/>
             <w:vAlign w:val="center"/>
           </w:tcPr>
@@ -9333,13 +7804,13 @@
                 <w:sz w:val="24"/>
                 <w:szCs w:val="18"/>
               </w:rPr>
-              <w:t>风险</w:t>
-            </w:r>
-          </w:p>
-        </w:tc>
-        <w:tc>
-          <w:tcPr>
-            <w:tcW w:w="3818" w:type="dxa"/>
+              <w:t>主要问题</w:t>
+            </w:r>
+          </w:p>
+        </w:tc>
+        <w:tc>
+          <w:tcPr>
+            <w:tcW w:w="2774" w:type="dxa"/>
             <w:shd w:val="clear" w:color="auto" w:fill="D9D9D9"/>
             <w:vAlign w:val="center"/>
           </w:tcPr>
@@ -9358,7 +7829,7 @@
                 <w:sz w:val="24"/>
                 <w:szCs w:val="18"/>
               </w:rPr>
-              <w:t>选择</w:t>
+              <w:t>结论</w:t>
             </w:r>
           </w:p>
         </w:tc>
@@ -9369,89 +7840,89 @@
         </w:trPr>
         <w:tc>
           <w:tcPr>
-            <w:tcW w:w="2858" w:type="dxa"/>
-            <w:vAlign w:val="center"/>
-          </w:tcPr>
-          <w:p>
-            <w:pPr>
-              <w:spacing w:line="276" w:lineRule="auto"/>
-              <w:rPr>
-                <w:sz w:val="24"/>
-              </w:rPr>
-            </w:pPr>
-            <w:r>
-              <w:rPr>
-                <w:rFonts w:ascii="Arial" w:hAnsi="Arial" w:eastAsia="宋体" w:cs="Arial"/>
-                <w:sz w:val="24"/>
-                <w:szCs w:val="18"/>
-              </w:rPr>
-              <w:t>仅脚本路径</w:t>
-            </w:r>
-          </w:p>
-        </w:tc>
-        <w:tc>
-          <w:tcPr>
-            <w:tcW w:w="4133" w:type="dxa"/>
-            <w:vAlign w:val="center"/>
-          </w:tcPr>
-          <w:p>
-            <w:pPr>
-              <w:spacing w:line="276" w:lineRule="auto"/>
-              <w:rPr>
-                <w:sz w:val="24"/>
-              </w:rPr>
-            </w:pPr>
-            <w:r>
-              <w:rPr>
-                <w:rFonts w:ascii="Arial" w:hAnsi="Arial" w:eastAsia="宋体" w:cs="Arial"/>
-                <w:sz w:val="24"/>
-                <w:szCs w:val="18"/>
-              </w:rPr>
-              <w:t>最简单，验证最快</w:t>
-            </w:r>
-          </w:p>
-        </w:tc>
-        <w:tc>
-          <w:tcPr>
-            <w:tcW w:w="4463" w:type="dxa"/>
-            <w:vAlign w:val="center"/>
-          </w:tcPr>
-          <w:p>
-            <w:pPr>
-              <w:spacing w:line="276" w:lineRule="auto"/>
-              <w:rPr>
-                <w:sz w:val="24"/>
-              </w:rPr>
-            </w:pPr>
-            <w:r>
-              <w:rPr>
-                <w:rFonts w:ascii="Arial" w:hAnsi="Arial" w:eastAsia="宋体" w:cs="Arial"/>
-                <w:sz w:val="24"/>
-                <w:szCs w:val="18"/>
-              </w:rPr>
-              <w:t>生产长任务可靠性不足</w:t>
-            </w:r>
-          </w:p>
-        </w:tc>
-        <w:tc>
-          <w:tcPr>
-            <w:tcW w:w="3818" w:type="dxa"/>
-            <w:vAlign w:val="center"/>
-          </w:tcPr>
-          <w:p>
-            <w:pPr>
-              <w:spacing w:line="276" w:lineRule="auto"/>
-              <w:rPr>
-                <w:sz w:val="24"/>
-              </w:rPr>
-            </w:pPr>
-            <w:r>
-              <w:rPr>
-                <w:rFonts w:ascii="Arial" w:hAnsi="Arial" w:eastAsia="宋体" w:cs="Arial"/>
-                <w:sz w:val="24"/>
-                <w:szCs w:val="18"/>
-              </w:rPr>
-              <w:t>否（单独作稳态）</w:t>
+            <w:tcW w:w="2600" w:type="dxa"/>
+            <w:vAlign w:val="center"/>
+          </w:tcPr>
+          <w:p>
+            <w:pPr>
+              <w:spacing w:line="276" w:lineRule="auto"/>
+              <w:rPr>
+                <w:sz w:val="24"/>
+              </w:rPr>
+            </w:pPr>
+            <w:r>
+              <w:rPr>
+                <w:rFonts w:ascii="Arial" w:hAnsi="Arial" w:eastAsia="宋体" w:cs="Arial"/>
+                <w:sz w:val="24"/>
+                <w:szCs w:val="18"/>
+              </w:rPr>
+              <w:t>仅脚本执行</w:t>
+            </w:r>
+          </w:p>
+        </w:tc>
+        <w:tc>
+          <w:tcPr>
+            <w:tcW w:w="4700" w:type="dxa"/>
+            <w:vAlign w:val="center"/>
+          </w:tcPr>
+          <w:p>
+            <w:pPr>
+              <w:spacing w:line="276" w:lineRule="auto"/>
+              <w:rPr>
+                <w:sz w:val="24"/>
+              </w:rPr>
+            </w:pPr>
+            <w:r>
+              <w:rPr>
+                <w:rFonts w:ascii="Arial" w:hAnsi="Arial" w:eastAsia="宋体" w:cs="Arial"/>
+                <w:sz w:val="24"/>
+                <w:szCs w:val="18"/>
+              </w:rPr>
+              <w:t>所有 SOP 由脚本直接承载，接入快、实现简单</w:t>
+            </w:r>
+          </w:p>
+        </w:tc>
+        <w:tc>
+          <w:tcPr>
+            <w:tcW w:w="5200" w:type="dxa"/>
+            <w:vAlign w:val="center"/>
+          </w:tcPr>
+          <w:p>
+            <w:pPr>
+              <w:spacing w:line="276" w:lineRule="auto"/>
+              <w:rPr>
+                <w:sz w:val="24"/>
+              </w:rPr>
+            </w:pPr>
+            <w:r>
+              <w:rPr>
+                <w:rFonts w:ascii="Arial" w:hAnsi="Arial" w:eastAsia="宋体" w:cs="Arial"/>
+                <w:sz w:val="24"/>
+                <w:szCs w:val="18"/>
+              </w:rPr>
+              <w:t>长任务可靠性、审计和复用不足</w:t>
+            </w:r>
+          </w:p>
+        </w:tc>
+        <w:tc>
+          <w:tcPr>
+            <w:tcW w:w="2774" w:type="dxa"/>
+            <w:vAlign w:val="center"/>
+          </w:tcPr>
+          <w:p>
+            <w:pPr>
+              <w:spacing w:line="276" w:lineRule="auto"/>
+              <w:rPr>
+                <w:sz w:val="24"/>
+              </w:rPr>
+            </w:pPr>
+            <w:r>
+              <w:rPr>
+                <w:rFonts w:ascii="Arial" w:hAnsi="Arial" w:eastAsia="宋体" w:cs="Arial"/>
+                <w:sz w:val="24"/>
+                <w:szCs w:val="18"/>
+              </w:rPr>
+              <w:t>不作为生产主路径</w:t>
             </w:r>
           </w:p>
         </w:tc>
@@ -9462,89 +7933,89 @@
         </w:trPr>
         <w:tc>
           <w:tcPr>
-            <w:tcW w:w="2858" w:type="dxa"/>
-            <w:vAlign w:val="center"/>
-          </w:tcPr>
-          <w:p>
-            <w:pPr>
-              <w:spacing w:line="276" w:lineRule="auto"/>
-              <w:rPr>
-                <w:sz w:val="24"/>
-              </w:rPr>
-            </w:pPr>
-            <w:r>
-              <w:rPr>
-                <w:rFonts w:ascii="Arial" w:hAnsi="Arial" w:eastAsia="宋体" w:cs="Arial"/>
-                <w:sz w:val="24"/>
-                <w:szCs w:val="18"/>
-              </w:rPr>
-              <w:t>仅 ClawFlow 路径</w:t>
-            </w:r>
-          </w:p>
-        </w:tc>
-        <w:tc>
-          <w:tcPr>
-            <w:tcW w:w="4133" w:type="dxa"/>
-            <w:vAlign w:val="center"/>
-          </w:tcPr>
-          <w:p>
-            <w:pPr>
-              <w:spacing w:line="276" w:lineRule="auto"/>
-              <w:rPr>
-                <w:sz w:val="24"/>
-              </w:rPr>
-            </w:pPr>
-            <w:r>
-              <w:rPr>
-                <w:rFonts w:ascii="Arial" w:hAnsi="Arial" w:eastAsia="宋体" w:cs="Arial"/>
-                <w:sz w:val="24"/>
-                <w:szCs w:val="18"/>
-              </w:rPr>
-              <w:t>可靠、可复用</w:t>
-            </w:r>
-          </w:p>
-        </w:tc>
-        <w:tc>
-          <w:tcPr>
-            <w:tcW w:w="4463" w:type="dxa"/>
-            <w:vAlign w:val="center"/>
-          </w:tcPr>
-          <w:p>
-            <w:pPr>
-              <w:spacing w:line="276" w:lineRule="auto"/>
-              <w:rPr>
-                <w:sz w:val="24"/>
-              </w:rPr>
-            </w:pPr>
-            <w:r>
-              <w:rPr>
-                <w:rFonts w:ascii="Arial" w:hAnsi="Arial" w:eastAsia="宋体" w:cs="Arial"/>
-                <w:sz w:val="24"/>
-                <w:szCs w:val="18"/>
-              </w:rPr>
-              <w:t>每个试错场景都上 ClawFlow，拖慢验证</w:t>
-            </w:r>
-          </w:p>
-        </w:tc>
-        <w:tc>
-          <w:tcPr>
-            <w:tcW w:w="3818" w:type="dxa"/>
-            <w:vAlign w:val="center"/>
-          </w:tcPr>
-          <w:p>
-            <w:pPr>
-              <w:spacing w:line="276" w:lineRule="auto"/>
-              <w:rPr>
-                <w:sz w:val="24"/>
-              </w:rPr>
-            </w:pPr>
-            <w:r>
-              <w:rPr>
-                <w:rFonts w:ascii="Arial" w:hAnsi="Arial" w:eastAsia="宋体" w:cs="Arial"/>
-                <w:sz w:val="24"/>
-                <w:szCs w:val="18"/>
-              </w:rPr>
-              <w:t>否（扼杀速度）</w:t>
+            <w:tcW w:w="2600" w:type="dxa"/>
+            <w:vAlign w:val="center"/>
+          </w:tcPr>
+          <w:p>
+            <w:pPr>
+              <w:spacing w:line="276" w:lineRule="auto"/>
+              <w:rPr>
+                <w:sz w:val="24"/>
+              </w:rPr>
+            </w:pPr>
+            <w:r>
+              <w:rPr>
+                <w:rFonts w:ascii="Arial" w:hAnsi="Arial" w:eastAsia="宋体" w:cs="Arial"/>
+                <w:sz w:val="24"/>
+                <w:szCs w:val="18"/>
+              </w:rPr>
+              <w:t>仅 ClawFlow 编排</w:t>
+            </w:r>
+          </w:p>
+        </w:tc>
+        <w:tc>
+          <w:tcPr>
+            <w:tcW w:w="4700" w:type="dxa"/>
+            <w:vAlign w:val="center"/>
+          </w:tcPr>
+          <w:p>
+            <w:pPr>
+              <w:spacing w:line="276" w:lineRule="auto"/>
+              <w:rPr>
+                <w:sz w:val="24"/>
+              </w:rPr>
+            </w:pPr>
+            <w:r>
+              <w:rPr>
+                <w:rFonts w:ascii="Arial" w:hAnsi="Arial" w:eastAsia="宋体" w:cs="Arial"/>
+                <w:sz w:val="24"/>
+                <w:szCs w:val="18"/>
+              </w:rPr>
+              <w:t>所有 SOP 通过流程建模执行，治理统一</w:t>
+            </w:r>
+          </w:p>
+        </w:tc>
+        <w:tc>
+          <w:tcPr>
+            <w:tcW w:w="5200" w:type="dxa"/>
+            <w:vAlign w:val="center"/>
+          </w:tcPr>
+          <w:p>
+            <w:pPr>
+              <w:spacing w:line="276" w:lineRule="auto"/>
+              <w:rPr>
+                <w:sz w:val="24"/>
+              </w:rPr>
+            </w:pPr>
+            <w:r>
+              <w:rPr>
+                <w:rFonts w:ascii="Arial" w:hAnsi="Arial" w:eastAsia="宋体" w:cs="Arial"/>
+                <w:sz w:val="24"/>
+                <w:szCs w:val="18"/>
+              </w:rPr>
+              <w:t>新场景验证成本高，简单任务也需流程化</w:t>
+            </w:r>
+          </w:p>
+        </w:tc>
+        <w:tc>
+          <w:tcPr>
+            <w:tcW w:w="2774" w:type="dxa"/>
+            <w:vAlign w:val="center"/>
+          </w:tcPr>
+          <w:p>
+            <w:pPr>
+              <w:spacing w:line="276" w:lineRule="auto"/>
+              <w:rPr>
+                <w:sz w:val="24"/>
+              </w:rPr>
+            </w:pPr>
+            <w:r>
+              <w:rPr>
+                <w:rFonts w:ascii="Arial" w:hAnsi="Arial" w:eastAsia="宋体" w:cs="Arial"/>
+                <w:sz w:val="24"/>
+                <w:szCs w:val="18"/>
+              </w:rPr>
+              <w:t>不作为唯一入口</w:t>
             </w:r>
           </w:p>
         </w:tc>
@@ -9555,89 +8026,89 @@
         </w:trPr>
         <w:tc>
           <w:tcPr>
-            <w:tcW w:w="2858" w:type="dxa"/>
-            <w:vAlign w:val="center"/>
-          </w:tcPr>
-          <w:p>
-            <w:pPr>
-              <w:spacing w:line="276" w:lineRule="auto"/>
-              <w:rPr>
-                <w:sz w:val="24"/>
-              </w:rPr>
-            </w:pPr>
-            <w:r>
-              <w:rPr>
-                <w:rFonts w:ascii="Arial" w:hAnsi="Arial" w:eastAsia="宋体" w:cs="Arial"/>
-                <w:sz w:val="24"/>
-                <w:szCs w:val="18"/>
-              </w:rPr>
-              <w:t>双路径并存</w:t>
-            </w:r>
-          </w:p>
-        </w:tc>
-        <w:tc>
-          <w:tcPr>
-            <w:tcW w:w="4133" w:type="dxa"/>
-            <w:vAlign w:val="center"/>
-          </w:tcPr>
-          <w:p>
-            <w:pPr>
-              <w:spacing w:line="276" w:lineRule="auto"/>
-              <w:rPr>
-                <w:sz w:val="24"/>
-              </w:rPr>
-            </w:pPr>
-            <w:r>
-              <w:rPr>
-                <w:rFonts w:ascii="Arial" w:hAnsi="Arial" w:eastAsia="宋体" w:cs="Arial"/>
-                <w:sz w:val="24"/>
-                <w:szCs w:val="18"/>
-              </w:rPr>
-              <w:t>验证走脚本，生产可靠走 ClawFlow</w:t>
-            </w:r>
-          </w:p>
-        </w:tc>
-        <w:tc>
-          <w:tcPr>
-            <w:tcW w:w="4463" w:type="dxa"/>
-            <w:vAlign w:val="center"/>
-          </w:tcPr>
-          <w:p>
-            <w:pPr>
-              <w:spacing w:line="276" w:lineRule="auto"/>
-              <w:rPr>
-                <w:sz w:val="24"/>
-              </w:rPr>
-            </w:pPr>
-            <w:r>
-              <w:rPr>
-                <w:rFonts w:ascii="Arial" w:hAnsi="Arial" w:eastAsia="宋体" w:cs="Arial"/>
-                <w:sz w:val="24"/>
-                <w:szCs w:val="18"/>
-              </w:rPr>
-              <w:t>双路径治理与 Skill 分类</w:t>
-            </w:r>
-          </w:p>
-        </w:tc>
-        <w:tc>
-          <w:tcPr>
-            <w:tcW w:w="3818" w:type="dxa"/>
-            <w:vAlign w:val="center"/>
-          </w:tcPr>
-          <w:p>
-            <w:pPr>
-              <w:spacing w:line="276" w:lineRule="auto"/>
-              <w:rPr>
-                <w:sz w:val="24"/>
-              </w:rPr>
-            </w:pPr>
-            <w:r>
-              <w:rPr>
-                <w:rFonts w:ascii="Arial" w:hAnsi="Arial" w:eastAsia="宋体" w:cs="Arial"/>
-                <w:sz w:val="24"/>
-                <w:szCs w:val="18"/>
-              </w:rPr>
-              <w:t>是</w:t>
+            <w:tcW w:w="2600" w:type="dxa"/>
+            <w:vAlign w:val="center"/>
+          </w:tcPr>
+          <w:p>
+            <w:pPr>
+              <w:spacing w:line="276" w:lineRule="auto"/>
+              <w:rPr>
+                <w:sz w:val="24"/>
+              </w:rPr>
+            </w:pPr>
+            <w:r>
+              <w:rPr>
+                <w:rFonts w:ascii="Arial" w:hAnsi="Arial" w:eastAsia="宋体" w:cs="Arial"/>
+                <w:sz w:val="24"/>
+                <w:szCs w:val="18"/>
+              </w:rPr>
+              <w:t>分层执行架构</w:t>
+            </w:r>
+          </w:p>
+        </w:tc>
+        <w:tc>
+          <w:tcPr>
+            <w:tcW w:w="4700" w:type="dxa"/>
+            <w:vAlign w:val="center"/>
+          </w:tcPr>
+          <w:p>
+            <w:pPr>
+              <w:spacing w:line="276" w:lineRule="auto"/>
+              <w:rPr>
+                <w:sz w:val="24"/>
+              </w:rPr>
+            </w:pPr>
+            <w:r>
+              <w:rPr>
+                <w:rFonts w:ascii="Arial" w:hAnsi="Arial" w:eastAsia="宋体" w:cs="Arial"/>
+                <w:sz w:val="24"/>
+                <w:szCs w:val="18"/>
+              </w:rPr>
+              <w:t>脚本承载轻量任务和能力验证；ClawFlow 承载生产 SOP</w:t>
+            </w:r>
+          </w:p>
+        </w:tc>
+        <w:tc>
+          <w:tcPr>
+            <w:tcW w:w="5200" w:type="dxa"/>
+            <w:vAlign w:val="center"/>
+          </w:tcPr>
+          <w:p>
+            <w:pPr>
+              <w:spacing w:line="276" w:lineRule="auto"/>
+              <w:rPr>
+                <w:sz w:val="24"/>
+              </w:rPr>
+            </w:pPr>
+            <w:r>
+              <w:rPr>
+                <w:rFonts w:ascii="Arial" w:hAnsi="Arial" w:eastAsia="宋体" w:cs="Arial"/>
+                <w:sz w:val="24"/>
+                <w:szCs w:val="18"/>
+              </w:rPr>
+              <w:t>需明确两种模式边界</w:t>
+            </w:r>
+          </w:p>
+        </w:tc>
+        <w:tc>
+          <w:tcPr>
+            <w:tcW w:w="2774" w:type="dxa"/>
+            <w:vAlign w:val="center"/>
+          </w:tcPr>
+          <w:p>
+            <w:pPr>
+              <w:spacing w:line="276" w:lineRule="auto"/>
+              <w:rPr>
+                <w:sz w:val="24"/>
+              </w:rPr>
+            </w:pPr>
+            <w:r>
+              <w:rPr>
+                <w:rFonts w:ascii="Arial" w:hAnsi="Arial" w:eastAsia="宋体" w:cs="Arial"/>
+                <w:sz w:val="24"/>
+                <w:szCs w:val="18"/>
+              </w:rPr>
+              <w:t>采用</w:t>
             </w:r>
           </w:p>
         </w:tc>
@@ -9646,60 +8117,51 @@
     <w:p>
       <w:pPr>
         <w:spacing w:line="360" w:lineRule="auto"/>
-        <w:rPr/>
-      </w:pPr>
+        <w:rPr>
+          <w:sz w:val="24"/>
+        </w:rPr>
+      </w:pPr>
+      <w:r>
+        <w:rPr>
+          <w:rFonts w:ascii="Arial" w:hAnsi="Arial" w:eastAsia="宋体" w:cs="Arial"/>
+          <w:sz w:val="24"/>
+          <w:szCs w:val="18"/>
+        </w:rPr>
+        <w:t/>
+      </w:r>
     </w:p>
     <w:p>
       <w:pPr>
-        <w:pStyle w:val="000031"/>
         <w:spacing w:line="360" w:lineRule="auto"/>
-        <w:ind w:firstLine="0"/>
-        <w:rPr/>
+        <w:rPr>
+          <w:sz w:val="24"/>
+        </w:rPr>
       </w:pPr>
       <w:r>
         <w:rPr>
           <w:rFonts w:ascii="Arial" w:hAnsi="Arial" w:eastAsia="宋体" w:cs="Arial"/>
-        </w:rPr>
-        <w:t>并存原则：</w:t>
+          <w:b/>
+          <w:bCs/>
+          <w:sz w:val="24"/>
+          <w:szCs w:val="18"/>
+        </w:rPr>
+        <w:t>选型结论：采用分层执行架构。</w:t>
       </w:r>
     </w:p>
     <w:p>
       <w:pPr>
         <w:spacing w:line="360" w:lineRule="auto"/>
-        <w:ind w:left="420" w:hanging="210"/>
-        <w:rPr/>
+        <w:rPr>
+          <w:sz w:val="24"/>
+        </w:rPr>
       </w:pPr>
       <w:r>
         <w:rPr>
           <w:rFonts w:ascii="Arial" w:hAnsi="Arial" w:eastAsia="宋体" w:cs="Arial"/>
-        </w:rPr>
-        <w:t>• 同一对话底座（Console + Runtime + 门禁 + 模型/绑定）共用。</w:t>
-      </w:r>
-    </w:p>
-    <w:p>
-      <w:pPr>
-        <w:spacing w:line="360" w:lineRule="auto"/>
-        <w:ind w:left="420" w:hanging="210"/>
-        <w:rPr/>
-      </w:pPr>
-      <w:r>
-        <w:rPr>
-          <w:rFonts w:ascii="Arial" w:hAnsi="Arial" w:eastAsia="宋体" w:cs="Arial"/>
-        </w:rPr>
-        <w:t>• 按 SOP/Skill 选型：快速验证、接口联调、演示 → 脚本型；多步写操作、长时、需恢复与强审计 → ClawFlow 路径。</w:t>
-      </w:r>
-    </w:p>
-    <w:p>
-      <w:pPr>
-        <w:spacing w:line="360" w:lineRule="auto"/>
-        <w:ind w:left="420" w:hanging="210"/>
-        <w:rPr/>
-      </w:pPr>
-      <w:r>
-        <w:rPr>
-          <w:rFonts w:ascii="Arial" w:hAnsi="Arial" w:eastAsia="宋体" w:cs="Arial"/>
-        </w:rPr>
-        <w:t>• 用户无感路径差异：服务经理仍企微一句话；差异在 Skill 实现形态与后端执行面。</w:t>
+          <w:sz w:val="24"/>
+          <w:szCs w:val="18"/>
+        </w:rPr>
+        <w:t>脚本用于快速形成能力，适合新场景验证、一次性任务和低风险自动化；ClawFlow 用于承载稳定 SOP，适合多步骤、长任务、失败恢复、审计和复用场景。重复使用且具备生产价值的脚本能力，逐步沉淀为 ClawFlow 节点或流程。</w:t>
       </w:r>
     </w:p>
     <w:p>
@@ -12757,13 +11219,863 @@
     <w:p>
       <w:pPr>
         <w:spacing w:line="360" w:lineRule="auto"/>
-        <w:rPr/>
-      </w:pPr>
-      <w:r>
-        <w:rPr>
-          <w:rFonts w:hint="eastAsia"/>
-        </w:rPr>
-        <w:t>略</w:t>
+        <w:rPr>
+          <w:sz w:val="24"/>
+        </w:rPr>
+      </w:pPr>
+      <w:r>
+        <w:rPr>
+          <w:rFonts w:ascii="Arial" w:hAnsi="Arial" w:eastAsia="宋体" w:cs="Arial"/>
+          <w:sz w:val="24"/>
+          <w:szCs w:val="18"/>
+        </w:rPr>
+        <w:t>开发视图描述开发环境中代码、模块、镜像制品和升级包的静态组织关系。本项目当前采用单一大仓库维护方式，Console 控制面、Runtime 工具链、Skill、插件、部署模板和镜像构建文件均在同一仓库中管理。</w:t>
+      </w:r>
+    </w:p>
+    <w:p>
+      <w:pPr>
+        <w:pStyle w:val="000031"/>
+        <w:spacing w:line="360" w:lineRule="auto"/>
+        <w:rPr>
+          <w:sz w:val="24"/>
+        </w:rPr>
+      </w:pPr>
+      <w:r>
+        <w:rPr>
+          <w:rFonts w:ascii="Arial" w:hAnsi="Arial" w:eastAsia="宋体" w:cs="Arial"/>
+          <w:sz w:val="24"/>
+          <w:szCs w:val="18"/>
+        </w:rPr>
+        <w:t>镜像制品组织</w:t>
+      </w:r>
+    </w:p>
+    <w:tbl>
+      <w:tblPr>
+        <w:tblStyle w:val="000012"/>
+        <w:tblW w:w="0" w:type="auto"/>
+        <w:tblInd w:w="0" w:type="dxa"/>
+        <w:tblBorders>
+          <w:top w:val="single" w:color="auto" w:sz="4" w:space="0"/>
+          <w:left w:val="single" w:color="auto" w:sz="4" w:space="0"/>
+          <w:bottom w:val="single" w:color="auto" w:sz="4" w:space="0"/>
+          <w:right w:val="single" w:color="auto" w:sz="4" w:space="0"/>
+          <w:insideH w:val="single" w:color="auto" w:sz="4" w:space="0"/>
+          <w:insideV w:val="single" w:color="auto" w:sz="4" w:space="0"/>
+        </w:tblBorders>
+        <w:tblLayout w:type="fixed"/>
+        <w:tblCellMar>
+          <w:top w:w="0" w:type="dxa"/>
+          <w:left w:w="108" w:type="dxa"/>
+          <w:bottom w:w="0" w:type="dxa"/>
+          <w:right w:w="108" w:type="dxa"/>
+        </w:tblCellMar>
+      </w:tblPr>
+      <w:tblGrid>
+        <w:gridCol w:w="3100"/>
+        <w:gridCol w:w="2800"/>
+        <w:gridCol w:w="3100"/>
+        <w:gridCol w:w="6174"/>
+      </w:tblGrid>
+      <w:tr>
+        <w:trPr>
+          <w:trHeight w:val="642" w:hRule="atLeast"/>
+        </w:trPr>
+        <w:tc>
+          <w:tcPr>
+            <w:tcW w:w="3100" w:type="dxa"/>
+            <w:shd w:val="clear" w:color="auto" w:fill="D9D9D9"/>
+            <w:vAlign w:val="center"/>
+          </w:tcPr>
+          <w:p>
+            <w:pPr>
+              <w:spacing w:line="276" w:lineRule="auto"/>
+              <w:rPr>
+                <w:sz w:val="24"/>
+              </w:rPr>
+            </w:pPr>
+            <w:r>
+              <w:rPr>
+                <w:rFonts w:ascii="Arial" w:hAnsi="Arial" w:eastAsia="宋体" w:cs="Arial"/>
+                <w:b/>
+                <w:bCs/>
+                <w:sz w:val="24"/>
+                <w:szCs w:val="18"/>
+              </w:rPr>
+              <w:t>镜像制品</w:t>
+            </w:r>
+          </w:p>
+        </w:tc>
+        <w:tc>
+          <w:tcPr>
+            <w:tcW w:w="2800" w:type="dxa"/>
+            <w:shd w:val="clear" w:color="auto" w:fill="D9D9D9"/>
+            <w:vAlign w:val="center"/>
+          </w:tcPr>
+          <w:p>
+            <w:pPr>
+              <w:spacing w:line="276" w:lineRule="auto"/>
+              <w:rPr>
+                <w:sz w:val="24"/>
+              </w:rPr>
+            </w:pPr>
+            <w:r>
+              <w:rPr>
+                <w:rFonts w:ascii="Arial" w:hAnsi="Arial" w:eastAsia="宋体" w:cs="Arial"/>
+                <w:b/>
+                <w:bCs/>
+                <w:sz w:val="24"/>
+                <w:szCs w:val="18"/>
+              </w:rPr>
+              <w:t>构建定位</w:t>
+            </w:r>
+          </w:p>
+        </w:tc>
+        <w:tc>
+          <w:tcPr>
+            <w:tcW w:w="3100" w:type="dxa"/>
+            <w:shd w:val="clear" w:color="auto" w:fill="D9D9D9"/>
+            <w:vAlign w:val="center"/>
+          </w:tcPr>
+          <w:p>
+            <w:pPr>
+              <w:spacing w:line="276" w:lineRule="auto"/>
+              <w:rPr>
+                <w:sz w:val="24"/>
+              </w:rPr>
+            </w:pPr>
+            <w:r>
+              <w:rPr>
+                <w:rFonts w:ascii="Arial" w:hAnsi="Arial" w:eastAsia="宋体" w:cs="Arial"/>
+                <w:b/>
+                <w:bCs/>
+                <w:sz w:val="24"/>
+                <w:szCs w:val="18"/>
+              </w:rPr>
+              <w:t>更新频率</w:t>
+            </w:r>
+          </w:p>
+        </w:tc>
+        <w:tc>
+          <w:tcPr>
+            <w:tcW w:w="6174" w:type="dxa"/>
+            <w:shd w:val="clear" w:color="auto" w:fill="D9D9D9"/>
+            <w:vAlign w:val="center"/>
+          </w:tcPr>
+          <w:p>
+            <w:pPr>
+              <w:spacing w:line="276" w:lineRule="auto"/>
+              <w:rPr>
+                <w:sz w:val="24"/>
+              </w:rPr>
+            </w:pPr>
+            <w:r>
+              <w:rPr>
+                <w:rFonts w:ascii="Arial" w:hAnsi="Arial" w:eastAsia="宋体" w:cs="Arial"/>
+                <w:b/>
+                <w:bCs/>
+                <w:sz w:val="24"/>
+                <w:szCs w:val="18"/>
+              </w:rPr>
+              <w:t>主要内容</w:t>
+            </w:r>
+          </w:p>
+        </w:tc>
+      </w:tr>
+      <w:tr>
+        <w:trPr>
+          <w:trHeight w:val="642" w:hRule="atLeast"/>
+        </w:trPr>
+        <w:tc>
+          <w:tcPr>
+            <w:tcW w:w="3100" w:type="dxa"/>
+            <w:vAlign w:val="center"/>
+          </w:tcPr>
+          <w:p>
+            <w:pPr>
+              <w:spacing w:line="276" w:lineRule="auto"/>
+              <w:rPr>
+                <w:sz w:val="24"/>
+              </w:rPr>
+            </w:pPr>
+            <w:r>
+              <w:rPr>
+                <w:rFonts w:ascii="Arial" w:hAnsi="Arial" w:eastAsia="宋体" w:cs="Arial"/>
+                <w:sz w:val="24"/>
+                <w:szCs w:val="18"/>
+              </w:rPr>
+              <w:t>muad-openclaw-base</w:t>
+            </w:r>
+          </w:p>
+        </w:tc>
+        <w:tc>
+          <w:tcPr>
+            <w:tcW w:w="2800" w:type="dxa"/>
+            <w:vAlign w:val="center"/>
+          </w:tcPr>
+          <w:p>
+            <w:pPr>
+              <w:spacing w:line="276" w:lineRule="auto"/>
+              <w:rPr>
+                <w:sz w:val="24"/>
+              </w:rPr>
+            </w:pPr>
+            <w:r>
+              <w:rPr>
+                <w:rFonts w:ascii="Arial" w:hAnsi="Arial" w:eastAsia="宋体" w:cs="Arial"/>
+                <w:sz w:val="24"/>
+                <w:szCs w:val="18"/>
+              </w:rPr>
+              <w:t>Runtime 基础镜像</w:t>
+            </w:r>
+          </w:p>
+        </w:tc>
+        <w:tc>
+          <w:tcPr>
+            <w:tcW w:w="3100" w:type="dxa"/>
+            <w:vAlign w:val="center"/>
+          </w:tcPr>
+          <w:p>
+            <w:pPr>
+              <w:spacing w:line="276" w:lineRule="auto"/>
+              <w:rPr>
+                <w:sz w:val="24"/>
+              </w:rPr>
+            </w:pPr>
+            <w:r>
+              <w:rPr>
+                <w:rFonts w:ascii="Arial" w:hAnsi="Arial" w:eastAsia="宋体" w:cs="Arial"/>
+                <w:sz w:val="24"/>
+                <w:szCs w:val="18"/>
+              </w:rPr>
+              <w:t>极低频，原则上只构建一次</w:t>
+            </w:r>
+          </w:p>
+        </w:tc>
+        <w:tc>
+          <w:tcPr>
+            <w:tcW w:w="6174" w:type="dxa"/>
+            <w:vAlign w:val="center"/>
+          </w:tcPr>
+          <w:p>
+            <w:pPr>
+              <w:spacing w:line="276" w:lineRule="auto"/>
+              <w:rPr>
+                <w:sz w:val="24"/>
+              </w:rPr>
+            </w:pPr>
+            <w:r>
+              <w:rPr>
+                <w:rFonts w:ascii="Arial" w:hAnsi="Arial" w:eastAsia="宋体" w:cs="Arial"/>
+                <w:sz w:val="24"/>
+                <w:szCs w:val="18"/>
+              </w:rPr>
+              <w:t>OpenClaw、浏览器、Playwright、IM 通道插件、基础配置种子</w:t>
+            </w:r>
+          </w:p>
+        </w:tc>
+      </w:tr>
+      <w:tr>
+        <w:trPr>
+          <w:trHeight w:val="642" w:hRule="atLeast"/>
+        </w:trPr>
+        <w:tc>
+          <w:tcPr>
+            <w:tcW w:w="3100" w:type="dxa"/>
+            <w:vAlign w:val="center"/>
+          </w:tcPr>
+          <w:p>
+            <w:pPr>
+              <w:spacing w:line="276" w:lineRule="auto"/>
+              <w:rPr>
+                <w:sz w:val="24"/>
+              </w:rPr>
+            </w:pPr>
+            <w:r>
+              <w:rPr>
+                <w:rFonts w:ascii="Arial" w:hAnsi="Arial" w:eastAsia="宋体" w:cs="Arial"/>
+                <w:sz w:val="24"/>
+                <w:szCs w:val="18"/>
+              </w:rPr>
+              <w:t>muad-openclaw</w:t>
+            </w:r>
+          </w:p>
+        </w:tc>
+        <w:tc>
+          <w:tcPr>
+            <w:tcW w:w="2800" w:type="dxa"/>
+            <w:vAlign w:val="center"/>
+          </w:tcPr>
+          <w:p>
+            <w:pPr>
+              <w:spacing w:line="276" w:lineRule="auto"/>
+              <w:rPr>
+                <w:sz w:val="24"/>
+              </w:rPr>
+            </w:pPr>
+            <w:r>
+              <w:rPr>
+                <w:rFonts w:ascii="Arial" w:hAnsi="Arial" w:eastAsia="宋体" w:cs="Arial"/>
+                <w:sz w:val="24"/>
+                <w:szCs w:val="18"/>
+              </w:rPr>
+              <w:t>Runtime 应用镜像</w:t>
+            </w:r>
+          </w:p>
+        </w:tc>
+        <w:tc>
+          <w:tcPr>
+            <w:tcW w:w="3100" w:type="dxa"/>
+            <w:vAlign w:val="center"/>
+          </w:tcPr>
+          <w:p>
+            <w:pPr>
+              <w:spacing w:line="276" w:lineRule="auto"/>
+              <w:rPr>
+                <w:sz w:val="24"/>
+              </w:rPr>
+            </w:pPr>
+            <w:r>
+              <w:rPr>
+                <w:rFonts w:ascii="Arial" w:hAnsi="Arial" w:eastAsia="宋体" w:cs="Arial"/>
+                <w:sz w:val="24"/>
+                <w:szCs w:val="18"/>
+              </w:rPr>
+              <w:t>高频，随 Runtime 工具链、Skill、业务插件发布</w:t>
+            </w:r>
+          </w:p>
+        </w:tc>
+        <w:tc>
+          <w:tcPr>
+            <w:tcW w:w="6174" w:type="dxa"/>
+            <w:vAlign w:val="center"/>
+          </w:tcPr>
+          <w:p>
+            <w:pPr>
+              <w:spacing w:line="276" w:lineRule="auto"/>
+              <w:rPr>
+                <w:sz w:val="24"/>
+              </w:rPr>
+            </w:pPr>
+            <w:r>
+              <w:rPr>
+                <w:rFonts w:ascii="Arial" w:hAnsi="Arial" w:eastAsia="宋体" w:cs="Arial"/>
+                <w:sz w:val="24"/>
+                <w:szCs w:val="18"/>
+              </w:rPr>
+              <w:t>基于基础镜像叠加业务插件、Skill、Runtime 配置注入、启动脚本</w:t>
+            </w:r>
+          </w:p>
+        </w:tc>
+      </w:tr>
+      <w:tr>
+        <w:trPr>
+          <w:trHeight w:val="642" w:hRule="atLeast"/>
+        </w:trPr>
+        <w:tc>
+          <w:tcPr>
+            <w:tcW w:w="3100" w:type="dxa"/>
+            <w:vAlign w:val="center"/>
+          </w:tcPr>
+          <w:p>
+            <w:pPr>
+              <w:spacing w:line="276" w:lineRule="auto"/>
+              <w:rPr>
+                <w:sz w:val="24"/>
+              </w:rPr>
+            </w:pPr>
+            <w:r>
+              <w:rPr>
+                <w:rFonts w:ascii="Arial" w:hAnsi="Arial" w:eastAsia="宋体" w:cs="Arial"/>
+                <w:sz w:val="24"/>
+                <w:szCs w:val="18"/>
+              </w:rPr>
+              <w:t>muad-console</w:t>
+            </w:r>
+          </w:p>
+        </w:tc>
+        <w:tc>
+          <w:tcPr>
+            <w:tcW w:w="2800" w:type="dxa"/>
+            <w:vAlign w:val="center"/>
+          </w:tcPr>
+          <w:p>
+            <w:pPr>
+              <w:spacing w:line="276" w:lineRule="auto"/>
+              <w:rPr>
+                <w:sz w:val="24"/>
+              </w:rPr>
+            </w:pPr>
+            <w:r>
+              <w:rPr>
+                <w:rFonts w:ascii="Arial" w:hAnsi="Arial" w:eastAsia="宋体" w:cs="Arial"/>
+                <w:sz w:val="24"/>
+                <w:szCs w:val="18"/>
+              </w:rPr>
+              <w:t>控制面镜像</w:t>
+            </w:r>
+          </w:p>
+        </w:tc>
+        <w:tc>
+          <w:tcPr>
+            <w:tcW w:w="3100" w:type="dxa"/>
+            <w:vAlign w:val="center"/>
+          </w:tcPr>
+          <w:p>
+            <w:pPr>
+              <w:spacing w:line="276" w:lineRule="auto"/>
+              <w:rPr>
+                <w:sz w:val="24"/>
+              </w:rPr>
+            </w:pPr>
+            <w:r>
+              <w:rPr>
+                <w:rFonts w:ascii="Arial" w:hAnsi="Arial" w:eastAsia="宋体" w:cs="Arial"/>
+                <w:sz w:val="24"/>
+                <w:szCs w:val="18"/>
+              </w:rPr>
+              <w:t>随 Console 功能发布</w:t>
+            </w:r>
+          </w:p>
+        </w:tc>
+        <w:tc>
+          <w:tcPr>
+            <w:tcW w:w="6174" w:type="dxa"/>
+            <w:vAlign w:val="center"/>
+          </w:tcPr>
+          <w:p>
+            <w:pPr>
+              <w:spacing w:line="276" w:lineRule="auto"/>
+              <w:rPr>
+                <w:sz w:val="24"/>
+              </w:rPr>
+            </w:pPr>
+            <w:r>
+              <w:rPr>
+                <w:rFonts w:ascii="Arial" w:hAnsi="Arial" w:eastAsia="宋体" w:cs="Arial"/>
+                <w:sz w:val="24"/>
+                <w:szCs w:val="18"/>
+              </w:rPr>
+              <w:t>Console 后端、前端静态资源、管理 API、数据库迁移能力</w:t>
+            </w:r>
+          </w:p>
+        </w:tc>
+      </w:tr>
+    </w:tbl>
+    <w:p>
+      <w:pPr>
+        <w:spacing w:line="360" w:lineRule="auto"/>
+        <w:rPr>
+          <w:sz w:val="24"/>
+        </w:rPr>
+      </w:pPr>
+      <w:r>
+        <w:rPr>
+          <w:rFonts w:ascii="Arial" w:hAnsi="Arial" w:eastAsia="宋体" w:cs="Arial"/>
+          <w:sz w:val="24"/>
+          <w:szCs w:val="18"/>
+        </w:rPr>
+        <w:t/>
+      </w:r>
+    </w:p>
+    <w:p>
+      <w:pPr>
+        <w:pStyle w:val="000031"/>
+        <w:spacing w:line="360" w:lineRule="auto"/>
+        <w:rPr>
+          <w:sz w:val="24"/>
+        </w:rPr>
+      </w:pPr>
+      <w:r>
+        <w:rPr>
+          <w:rFonts w:ascii="Arial" w:hAnsi="Arial" w:eastAsia="宋体" w:cs="Arial"/>
+          <w:sz w:val="24"/>
+          <w:szCs w:val="18"/>
+        </w:rPr>
+        <w:t>构建与升级过程</w:t>
+      </w:r>
+    </w:p>
+    <w:p>
+      <w:pPr>
+        <w:spacing w:line="360" w:lineRule="auto"/>
+        <w:rPr>
+          <w:sz w:val="24"/>
+        </w:rPr>
+      </w:pPr>
+      <w:r>
+        <w:rPr>
+          <w:rFonts w:ascii="Arial" w:hAnsi="Arial" w:eastAsia="宋体" w:cs="Arial"/>
+          <w:sz w:val="24"/>
+          <w:szCs w:val="18"/>
+        </w:rPr>
+        <w:t>日常版本升级主要围绕 muad-openclaw 应用镜像和 muad-console 控制面镜像展开。muad-openclaw-base 作为稳定基础层，仅在底层运行环境变化时单独升级。</w:t>
+      </w:r>
+    </w:p>
+    <w:tbl>
+      <w:tblPr>
+        <w:tblStyle w:val="000012"/>
+        <w:tblW w:w="0" w:type="auto"/>
+        <w:tblInd w:w="0" w:type="dxa"/>
+        <w:tblBorders>
+          <w:top w:val="single" w:color="auto" w:sz="4" w:space="0"/>
+          <w:left w:val="single" w:color="auto" w:sz="4" w:space="0"/>
+          <w:bottom w:val="single" w:color="auto" w:sz="4" w:space="0"/>
+          <w:right w:val="single" w:color="auto" w:sz="4" w:space="0"/>
+          <w:insideH w:val="single" w:color="auto" w:sz="4" w:space="0"/>
+          <w:insideV w:val="single" w:color="auto" w:sz="4" w:space="0"/>
+        </w:tblBorders>
+        <w:tblLayout w:type="fixed"/>
+        <w:tblCellMar>
+          <w:top w:w="0" w:type="dxa"/>
+          <w:left w:w="108" w:type="dxa"/>
+          <w:bottom w:w="0" w:type="dxa"/>
+          <w:right w:w="108" w:type="dxa"/>
+        </w:tblCellMar>
+      </w:tblPr>
+      <w:tblGrid>
+        <w:gridCol w:w="3000"/>
+        <w:gridCol w:w="5000"/>
+        <w:gridCol w:w="7274"/>
+      </w:tblGrid>
+      <w:tr>
+        <w:trPr>
+          <w:trHeight w:val="642" w:hRule="atLeast"/>
+        </w:trPr>
+        <w:tc>
+          <w:tcPr>
+            <w:tcW w:w="3000" w:type="dxa"/>
+            <w:shd w:val="clear" w:color="auto" w:fill="D9D9D9"/>
+            <w:vAlign w:val="center"/>
+          </w:tcPr>
+          <w:p>
+            <w:pPr>
+              <w:spacing w:line="276" w:lineRule="auto"/>
+              <w:rPr>
+                <w:sz w:val="24"/>
+              </w:rPr>
+            </w:pPr>
+            <w:r>
+              <w:rPr>
+                <w:rFonts w:ascii="Arial" w:hAnsi="Arial" w:eastAsia="宋体" w:cs="Arial"/>
+                <w:b/>
+                <w:bCs/>
+                <w:sz w:val="24"/>
+                <w:szCs w:val="18"/>
+              </w:rPr>
+              <w:t>升级主线</w:t>
+            </w:r>
+          </w:p>
+        </w:tc>
+        <w:tc>
+          <w:tcPr>
+            <w:tcW w:w="5000" w:type="dxa"/>
+            <w:shd w:val="clear" w:color="auto" w:fill="D9D9D9"/>
+            <w:vAlign w:val="center"/>
+          </w:tcPr>
+          <w:p>
+            <w:pPr>
+              <w:spacing w:line="276" w:lineRule="auto"/>
+              <w:rPr>
+                <w:sz w:val="24"/>
+              </w:rPr>
+            </w:pPr>
+            <w:r>
+              <w:rPr>
+                <w:rFonts w:ascii="Arial" w:hAnsi="Arial" w:eastAsia="宋体" w:cs="Arial"/>
+                <w:b/>
+                <w:bCs/>
+                <w:sz w:val="24"/>
+                <w:szCs w:val="18"/>
+              </w:rPr>
+              <w:t>触发条件</w:t>
+            </w:r>
+          </w:p>
+        </w:tc>
+        <w:tc>
+          <w:tcPr>
+            <w:tcW w:w="7274" w:type="dxa"/>
+            <w:shd w:val="clear" w:color="auto" w:fill="D9D9D9"/>
+            <w:vAlign w:val="center"/>
+          </w:tcPr>
+          <w:p>
+            <w:pPr>
+              <w:spacing w:line="276" w:lineRule="auto"/>
+              <w:rPr>
+                <w:sz w:val="24"/>
+              </w:rPr>
+            </w:pPr>
+            <w:r>
+              <w:rPr>
+                <w:rFonts w:ascii="Arial" w:hAnsi="Arial" w:eastAsia="宋体" w:cs="Arial"/>
+                <w:b/>
+                <w:bCs/>
+                <w:sz w:val="24"/>
+                <w:szCs w:val="18"/>
+              </w:rPr>
+              <w:t>交付内容</w:t>
+            </w:r>
+          </w:p>
+        </w:tc>
+      </w:tr>
+      <w:tr>
+        <w:trPr>
+          <w:trHeight w:val="642" w:hRule="atLeast"/>
+        </w:trPr>
+        <w:tc>
+          <w:tcPr>
+            <w:tcW w:w="3000" w:type="dxa"/>
+            <w:vAlign w:val="center"/>
+          </w:tcPr>
+          <w:p>
+            <w:pPr>
+              <w:spacing w:line="276" w:lineRule="auto"/>
+              <w:rPr>
+                <w:sz w:val="24"/>
+              </w:rPr>
+            </w:pPr>
+            <w:r>
+              <w:rPr>
+                <w:rFonts w:ascii="Arial" w:hAnsi="Arial" w:eastAsia="宋体" w:cs="Arial"/>
+                <w:sz w:val="24"/>
+                <w:szCs w:val="18"/>
+              </w:rPr>
+              <w:t>Runtime 应用镜像升级</w:t>
+            </w:r>
+          </w:p>
+        </w:tc>
+        <w:tc>
+          <w:tcPr>
+            <w:tcW w:w="5000" w:type="dxa"/>
+            <w:vAlign w:val="center"/>
+          </w:tcPr>
+          <w:p>
+            <w:pPr>
+              <w:spacing w:line="276" w:lineRule="auto"/>
+              <w:rPr>
+                <w:sz w:val="24"/>
+              </w:rPr>
+            </w:pPr>
+            <w:r>
+              <w:rPr>
+                <w:rFonts w:ascii="Arial" w:hAnsi="Arial" w:eastAsia="宋体" w:cs="Arial"/>
+                <w:sz w:val="24"/>
+                <w:szCs w:val="18"/>
+              </w:rPr>
+              <w:t>业务插件、Skill、Runtime 工具链、配置渲染或启动逻辑变化</w:t>
+            </w:r>
+          </w:p>
+        </w:tc>
+        <w:tc>
+          <w:tcPr>
+            <w:tcW w:w="7274" w:type="dxa"/>
+            <w:vAlign w:val="center"/>
+          </w:tcPr>
+          <w:p>
+            <w:pPr>
+              <w:spacing w:line="276" w:lineRule="auto"/>
+              <w:rPr>
+                <w:sz w:val="24"/>
+              </w:rPr>
+            </w:pPr>
+            <w:r>
+              <w:rPr>
+                <w:rFonts w:ascii="Arial" w:hAnsi="Arial" w:eastAsia="宋体" w:cs="Arial"/>
+                <w:sz w:val="24"/>
+                <w:szCs w:val="18"/>
+              </w:rPr>
+              <w:t>发布 muad-openclaw:&lt;version&gt;，复用既有 muad-openclaw-base</w:t>
+            </w:r>
+          </w:p>
+        </w:tc>
+      </w:tr>
+      <w:tr>
+        <w:trPr>
+          <w:trHeight w:val="642" w:hRule="atLeast"/>
+        </w:trPr>
+        <w:tc>
+          <w:tcPr>
+            <w:tcW w:w="3000" w:type="dxa"/>
+            <w:vAlign w:val="center"/>
+          </w:tcPr>
+          <w:p>
+            <w:pPr>
+              <w:spacing w:line="276" w:lineRule="auto"/>
+              <w:rPr>
+                <w:sz w:val="24"/>
+              </w:rPr>
+            </w:pPr>
+            <w:r>
+              <w:rPr>
+                <w:rFonts w:ascii="Arial" w:hAnsi="Arial" w:eastAsia="宋体" w:cs="Arial"/>
+                <w:sz w:val="24"/>
+                <w:szCs w:val="18"/>
+              </w:rPr>
+              <w:t>Console 控制面升级</w:t>
+            </w:r>
+          </w:p>
+        </w:tc>
+        <w:tc>
+          <w:tcPr>
+            <w:tcW w:w="5000" w:type="dxa"/>
+            <w:vAlign w:val="center"/>
+          </w:tcPr>
+          <w:p>
+            <w:pPr>
+              <w:spacing w:line="276" w:lineRule="auto"/>
+              <w:rPr>
+                <w:sz w:val="24"/>
+              </w:rPr>
+            </w:pPr>
+            <w:r>
+              <w:rPr>
+                <w:rFonts w:ascii="Arial" w:hAnsi="Arial" w:eastAsia="宋体" w:cs="Arial"/>
+                <w:sz w:val="24"/>
+                <w:szCs w:val="18"/>
+              </w:rPr>
+              <w:t>控制面 API、前端页面、数据库 schema 或管理功能变化</w:t>
+            </w:r>
+          </w:p>
+        </w:tc>
+        <w:tc>
+          <w:tcPr>
+            <w:tcW w:w="7274" w:type="dxa"/>
+            <w:vAlign w:val="center"/>
+          </w:tcPr>
+          <w:p>
+            <w:pPr>
+              <w:spacing w:line="276" w:lineRule="auto"/>
+              <w:rPr>
+                <w:sz w:val="24"/>
+              </w:rPr>
+            </w:pPr>
+            <w:r>
+              <w:rPr>
+                <w:rFonts w:ascii="Arial" w:hAnsi="Arial" w:eastAsia="宋体" w:cs="Arial"/>
+                <w:sz w:val="24"/>
+                <w:szCs w:val="18"/>
+              </w:rPr>
+              <w:t>发布 muad-console:&lt;version&gt;，携带数据库迁移、配置变更和回滚说明</w:t>
+            </w:r>
+          </w:p>
+        </w:tc>
+      </w:tr>
+      <w:tr>
+        <w:trPr>
+          <w:trHeight w:val="642" w:hRule="atLeast"/>
+        </w:trPr>
+        <w:tc>
+          <w:tcPr>
+            <w:tcW w:w="3000" w:type="dxa"/>
+            <w:vAlign w:val="center"/>
+          </w:tcPr>
+          <w:p>
+            <w:pPr>
+              <w:spacing w:line="276" w:lineRule="auto"/>
+              <w:rPr>
+                <w:sz w:val="24"/>
+              </w:rPr>
+            </w:pPr>
+            <w:r>
+              <w:rPr>
+                <w:rFonts w:ascii="Arial" w:hAnsi="Arial" w:eastAsia="宋体" w:cs="Arial"/>
+                <w:sz w:val="24"/>
+                <w:szCs w:val="18"/>
+              </w:rPr>
+              <w:t>基础镜像升级</w:t>
+            </w:r>
+          </w:p>
+        </w:tc>
+        <w:tc>
+          <w:tcPr>
+            <w:tcW w:w="5000" w:type="dxa"/>
+            <w:vAlign w:val="center"/>
+          </w:tcPr>
+          <w:p>
+            <w:pPr>
+              <w:spacing w:line="276" w:lineRule="auto"/>
+              <w:rPr>
+                <w:sz w:val="24"/>
+              </w:rPr>
+            </w:pPr>
+            <w:r>
+              <w:rPr>
+                <w:rFonts w:ascii="Arial" w:hAnsi="Arial" w:eastAsia="宋体" w:cs="Arial"/>
+                <w:sz w:val="24"/>
+                <w:szCs w:val="18"/>
+              </w:rPr>
+              <w:t>OpenClaw、浏览器、Playwright 或 IM 通道插件升级</w:t>
+            </w:r>
+          </w:p>
+        </w:tc>
+        <w:tc>
+          <w:tcPr>
+            <w:tcW w:w="7274" w:type="dxa"/>
+            <w:vAlign w:val="center"/>
+          </w:tcPr>
+          <w:p>
+            <w:pPr>
+              <w:spacing w:line="276" w:lineRule="auto"/>
+              <w:rPr>
+                <w:sz w:val="24"/>
+              </w:rPr>
+            </w:pPr>
+            <w:r>
+              <w:rPr>
+                <w:rFonts w:ascii="Arial" w:hAnsi="Arial" w:eastAsia="宋体" w:cs="Arial"/>
+                <w:sz w:val="24"/>
+                <w:szCs w:val="18"/>
+              </w:rPr>
+              <w:t>单独发布 muad-openclaw-base:&lt;base-version&gt;，日常业务版本不重复构建</w:t>
+            </w:r>
+          </w:p>
+        </w:tc>
+      </w:tr>
+    </w:tbl>
+    <w:p>
+      <w:pPr>
+        <w:spacing w:line="360" w:lineRule="auto"/>
+        <w:rPr>
+          <w:sz w:val="24"/>
+        </w:rPr>
+      </w:pPr>
+      <w:r>
+        <w:rPr>
+          <w:rFonts w:ascii="Arial" w:hAnsi="Arial" w:eastAsia="宋体" w:cs="Arial"/>
+          <w:sz w:val="24"/>
+          <w:szCs w:val="18"/>
+        </w:rPr>
+        <w:t/>
+      </w:r>
+    </w:p>
+    <w:p>
+      <w:pPr>
+        <w:spacing w:line="360" w:lineRule="auto"/>
+        <w:rPr>
+          <w:sz w:val="24"/>
+        </w:rPr>
+      </w:pPr>
+      <w:r>
+        <w:rPr>
+          <w:rFonts w:ascii="Arial" w:hAnsi="Arial" w:eastAsia="宋体" w:cs="Arial"/>
+          <w:sz w:val="24"/>
+          <w:szCs w:val="18"/>
+        </w:rPr>
+        <w:t>升级包交付物包括 Runtime 应用镜像、Console 控制面镜像、基础镜像版本说明、Docker Compose / Kubernetes 部署模板、配置样例、数据库迁移说明、升级步骤和回滚说明。</w:t>
+      </w:r>
+    </w:p>
+    <w:p>
+      <w:pPr>
+        <w:spacing w:line="360" w:lineRule="auto"/>
+        <w:rPr>
+          <w:sz w:val="24"/>
+        </w:rPr>
+      </w:pPr>
+      <w:r>
+        <w:rPr>
+          <w:rFonts w:ascii="Arial" w:hAnsi="Arial" w:eastAsia="宋体" w:cs="Arial"/>
+          <w:sz w:val="24"/>
+          <w:szCs w:val="18"/>
+        </w:rPr>
+        <w:t/>
       </w:r>
     </w:p>
     <w:p>

</xml_diff>